<commit_message>
docs(report): full product backlog table (FR-1..14) + accurate Tools section
</commit_message>
<xml_diff>
--- a/docs/report/NextStay_Report.docx
+++ b/docs/report/NextStay_Report.docx
@@ -1117,9 +1117,522 @@
     </w:p>
     <w:p>
       <w:r>
-        <w:t>User stories were derived from FR-1…FR-14 and estimated in story points. Examples: “As a guest I can log in with an email OTP so that I can access the portal securely” (FR-1, 5pts); “As an owner I can train a per-hotel pricing model so that prices adapt to demand” (FR-6, 13pts); “As a manager I can see occupancy and RevPAR dashboards so that I can plan” (FR-14, 8pts).</w:t>
-      </w:r>
-    </w:p>
+        <w:t>User stories derived from FR-1…FR-14, estimated in story points (SP).</w:t>
+      </w:r>
+    </w:p>
+    <w:tbl>
+      <w:tblPr>
+        <w:tblW w:type="auto" w:w="0"/>
+        <w:jc w:val="center"/>
+        <w:tblLook w:firstColumn="1" w:firstRow="1" w:lastColumn="0" w:lastRow="0" w:noHBand="0" w:noVBand="1" w:val="04A0"/>
+        <w:tblBorders>
+          <w:top w:val="single" w:sz="4" w:color="999999"/>
+          <w:left w:val="single" w:sz="4" w:color="999999"/>
+          <w:bottom w:val="single" w:sz="4" w:color="999999"/>
+          <w:right w:val="single" w:sz="4" w:color="999999"/>
+          <w:insideH w:val="single" w:sz="4" w:color="999999"/>
+          <w:insideV w:val="single" w:sz="4" w:color="999999"/>
+        </w:tblBorders>
+      </w:tblPr>
+      <w:tblGrid>
+        <w:gridCol w:w="3009"/>
+        <w:gridCol w:w="3009"/>
+        <w:gridCol w:w="3009"/>
+      </w:tblGrid>
+      <w:tr>
+        <w:tc>
+          <w:tcPr>
+            <w:tcW w:type="dxa" w:w="3009"/>
+          </w:tcPr>
+          <w:p>
+            <w:r/>
+            <w:r>
+              <w:rPr>
+                <w:b/>
+              </w:rPr>
+              <w:t>FR</w:t>
+            </w:r>
+          </w:p>
+        </w:tc>
+        <w:tc>
+          <w:tcPr>
+            <w:tcW w:type="dxa" w:w="3009"/>
+          </w:tcPr>
+          <w:p>
+            <w:r/>
+            <w:r>
+              <w:rPr>
+                <w:b/>
+              </w:rPr>
+              <w:t>User story</w:t>
+            </w:r>
+          </w:p>
+        </w:tc>
+        <w:tc>
+          <w:tcPr>
+            <w:tcW w:type="dxa" w:w="3009"/>
+          </w:tcPr>
+          <w:p>
+            <w:r/>
+            <w:r>
+              <w:rPr>
+                <w:b/>
+              </w:rPr>
+              <w:t>SP</w:t>
+            </w:r>
+          </w:p>
+        </w:tc>
+      </w:tr>
+      <w:tr>
+        <w:tc>
+          <w:tcPr>
+            <w:tcW w:type="dxa" w:w="3009"/>
+          </w:tcPr>
+          <w:p>
+            <w:r>
+              <w:t>FR-1</w:t>
+            </w:r>
+          </w:p>
+        </w:tc>
+        <w:tc>
+          <w:tcPr>
+            <w:tcW w:type="dxa" w:w="3009"/>
+          </w:tcPr>
+          <w:p>
+            <w:r>
+              <w:t>As a user I log in via email OTP and receive a JWT so access is secure</w:t>
+            </w:r>
+          </w:p>
+        </w:tc>
+        <w:tc>
+          <w:tcPr>
+            <w:tcW w:type="dxa" w:w="3009"/>
+          </w:tcPr>
+          <w:p>
+            <w:r>
+              <w:t>5</w:t>
+            </w:r>
+          </w:p>
+        </w:tc>
+      </w:tr>
+      <w:tr>
+        <w:tc>
+          <w:tcPr>
+            <w:tcW w:type="dxa" w:w="3009"/>
+          </w:tcPr>
+          <w:p>
+            <w:r>
+              <w:t>FR-2</w:t>
+            </w:r>
+          </w:p>
+        </w:tc>
+        <w:tc>
+          <w:tcPr>
+            <w:tcW w:type="dxa" w:w="3009"/>
+          </w:tcPr>
+          <w:p>
+            <w:r>
+              <w:t>As an admin I have role-based access so permissions are enforced</w:t>
+            </w:r>
+          </w:p>
+        </w:tc>
+        <w:tc>
+          <w:tcPr>
+            <w:tcW w:type="dxa" w:w="3009"/>
+          </w:tcPr>
+          <w:p>
+            <w:r>
+              <w:t>3</w:t>
+            </w:r>
+          </w:p>
+        </w:tc>
+      </w:tr>
+      <w:tr>
+        <w:tc>
+          <w:tcPr>
+            <w:tcW w:type="dxa" w:w="3009"/>
+          </w:tcPr>
+          <w:p>
+            <w:r>
+              <w:t>FR-3</w:t>
+            </w:r>
+          </w:p>
+        </w:tc>
+        <w:tc>
+          <w:tcPr>
+            <w:tcW w:type="dxa" w:w="3009"/>
+          </w:tcPr>
+          <w:p>
+            <w:r>
+              <w:t>As staff I create/read/update/delete rooms and set up inventory</w:t>
+            </w:r>
+          </w:p>
+        </w:tc>
+        <w:tc>
+          <w:tcPr>
+            <w:tcW w:type="dxa" w:w="3009"/>
+          </w:tcPr>
+          <w:p>
+            <w:r>
+              <w:t>5</w:t>
+            </w:r>
+          </w:p>
+        </w:tc>
+      </w:tr>
+      <w:tr>
+        <w:tc>
+          <w:tcPr>
+            <w:tcW w:type="dxa" w:w="3009"/>
+          </w:tcPr>
+          <w:p>
+            <w:r>
+              <w:t>FR-4</w:t>
+            </w:r>
+          </w:p>
+        </w:tc>
+        <w:tc>
+          <w:tcPr>
+            <w:tcW w:type="dxa" w:w="3009"/>
+          </w:tcPr>
+          <w:p>
+            <w:r>
+              <w:t>As a guest I check availability and hold a room before paying</w:t>
+            </w:r>
+          </w:p>
+        </w:tc>
+        <w:tc>
+          <w:tcPr>
+            <w:tcW w:type="dxa" w:w="3009"/>
+          </w:tcPr>
+          <w:p>
+            <w:r>
+              <w:t>8</w:t>
+            </w:r>
+          </w:p>
+        </w:tc>
+      </w:tr>
+      <w:tr>
+        <w:tc>
+          <w:tcPr>
+            <w:tcW w:type="dxa" w:w="3009"/>
+          </w:tcPr>
+          <w:p>
+            <w:r>
+              <w:t>FR-5</w:t>
+            </w:r>
+          </w:p>
+        </w:tc>
+        <w:tc>
+          <w:tcPr>
+            <w:tcW w:type="dxa" w:w="3009"/>
+          </w:tcPr>
+          <w:p>
+            <w:r>
+              <w:t>As a guest I pay via Stripe so my booking is confirmed</w:t>
+            </w:r>
+          </w:p>
+        </w:tc>
+        <w:tc>
+          <w:tcPr>
+            <w:tcW w:type="dxa" w:w="3009"/>
+          </w:tcPr>
+          <w:p>
+            <w:r>
+              <w:t>8</w:t>
+            </w:r>
+          </w:p>
+        </w:tc>
+      </w:tr>
+      <w:tr>
+        <w:tc>
+          <w:tcPr>
+            <w:tcW w:type="dxa" w:w="3009"/>
+          </w:tcPr>
+          <w:p>
+            <w:r>
+              <w:t>FR-6</w:t>
+            </w:r>
+          </w:p>
+        </w:tc>
+        <w:tc>
+          <w:tcPr>
+            <w:tcW w:type="dxa" w:w="3009"/>
+          </w:tcPr>
+          <w:p>
+            <w:r>
+              <w:t>As an owner I train a per-hotel model and publish dynamic prices</w:t>
+            </w:r>
+          </w:p>
+        </w:tc>
+        <w:tc>
+          <w:tcPr>
+            <w:tcW w:type="dxa" w:w="3009"/>
+          </w:tcPr>
+          <w:p>
+            <w:r>
+              <w:t>13</w:t>
+            </w:r>
+          </w:p>
+        </w:tc>
+      </w:tr>
+      <w:tr>
+        <w:tc>
+          <w:tcPr>
+            <w:tcW w:type="dxa" w:w="3009"/>
+          </w:tcPr>
+          <w:p>
+            <w:r>
+              <w:t>FR-7</w:t>
+            </w:r>
+          </w:p>
+        </w:tc>
+        <w:tc>
+          <w:tcPr>
+            <w:tcW w:type="dxa" w:w="3009"/>
+          </w:tcPr>
+          <w:p>
+            <w:r>
+              <w:t>As a manager I schedule shifts and auto-assign housekeeping tasks</w:t>
+            </w:r>
+          </w:p>
+        </w:tc>
+        <w:tc>
+          <w:tcPr>
+            <w:tcW w:type="dxa" w:w="3009"/>
+          </w:tcPr>
+          <w:p>
+            <w:r>
+              <w:t>8</w:t>
+            </w:r>
+          </w:p>
+        </w:tc>
+      </w:tr>
+      <w:tr>
+        <w:tc>
+          <w:tcPr>
+            <w:tcW w:type="dxa" w:w="3009"/>
+          </w:tcPr>
+          <w:p>
+            <w:r>
+              <w:t>FR-8</w:t>
+            </w:r>
+          </w:p>
+        </w:tc>
+        <w:tc>
+          <w:tcPr>
+            <w:tcW w:type="dxa" w:w="3009"/>
+          </w:tcPr>
+          <w:p>
+            <w:r>
+              <w:t>As an admin I see a dashboard with KPIs and quick links</w:t>
+            </w:r>
+          </w:p>
+        </w:tc>
+        <w:tc>
+          <w:tcPr>
+            <w:tcW w:type="dxa" w:w="3009"/>
+          </w:tcPr>
+          <w:p>
+            <w:r>
+              <w:t>5</w:t>
+            </w:r>
+          </w:p>
+        </w:tc>
+      </w:tr>
+      <w:tr>
+        <w:tc>
+          <w:tcPr>
+            <w:tcW w:type="dxa" w:w="3009"/>
+          </w:tcPr>
+          <w:p>
+            <w:r>
+              <w:t>FR-9</w:t>
+            </w:r>
+          </w:p>
+        </w:tc>
+        <w:tc>
+          <w:tcPr>
+            <w:tcW w:type="dxa" w:w="3009"/>
+          </w:tcPr>
+          <w:p>
+            <w:r>
+              <w:t>As a guest I access my stay details by token without logging in</w:t>
+            </w:r>
+          </w:p>
+        </w:tc>
+        <w:tc>
+          <w:tcPr>
+            <w:tcW w:type="dxa" w:w="3009"/>
+          </w:tcPr>
+          <w:p>
+            <w:r>
+              <w:t>5</w:t>
+            </w:r>
+          </w:p>
+        </w:tc>
+      </w:tr>
+      <w:tr>
+        <w:tc>
+          <w:tcPr>
+            <w:tcW w:type="dxa" w:w="3009"/>
+          </w:tcPr>
+          <w:p>
+            <w:r>
+              <w:t>FR-10</w:t>
+            </w:r>
+          </w:p>
+        </w:tc>
+        <w:tc>
+          <w:tcPr>
+            <w:tcW w:type="dxa" w:w="3009"/>
+          </w:tcPr>
+          <w:p>
+            <w:r>
+              <w:t>As a guest I complete booking with success/cancel pages</w:t>
+            </w:r>
+          </w:p>
+        </w:tc>
+        <w:tc>
+          <w:tcPr>
+            <w:tcW w:type="dxa" w:w="3009"/>
+          </w:tcPr>
+          <w:p>
+            <w:r>
+              <w:t>3</w:t>
+            </w:r>
+          </w:p>
+        </w:tc>
+      </w:tr>
+      <w:tr>
+        <w:tc>
+          <w:tcPr>
+            <w:tcW w:type="dxa" w:w="3009"/>
+          </w:tcPr>
+          <w:p>
+            <w:r>
+              <w:t>FR-11</w:t>
+            </w:r>
+          </w:p>
+        </w:tc>
+        <w:tc>
+          <w:tcPr>
+            <w:tcW w:type="dxa" w:w="3009"/>
+          </w:tcPr>
+          <w:p>
+            <w:r>
+              <w:t>As staff I start my shift and see my assigned tasks</w:t>
+            </w:r>
+          </w:p>
+        </w:tc>
+        <w:tc>
+          <w:tcPr>
+            <w:tcW w:type="dxa" w:w="3009"/>
+          </w:tcPr>
+          <w:p>
+            <w:r>
+              <w:t>5</w:t>
+            </w:r>
+          </w:p>
+        </w:tc>
+      </w:tr>
+      <w:tr>
+        <w:tc>
+          <w:tcPr>
+            <w:tcW w:type="dxa" w:w="3009"/>
+          </w:tcPr>
+          <w:p>
+            <w:r>
+              <w:t>FR-12</w:t>
+            </w:r>
+          </w:p>
+        </w:tc>
+        <w:tc>
+          <w:tcPr>
+            <w:tcW w:type="dxa" w:w="3009"/>
+          </w:tcPr>
+          <w:p>
+            <w:r>
+              <w:t>As a manager I view bookings/revenue reports</w:t>
+            </w:r>
+          </w:p>
+        </w:tc>
+        <w:tc>
+          <w:tcPr>
+            <w:tcW w:type="dxa" w:w="3009"/>
+          </w:tcPr>
+          <w:p>
+            <w:r>
+              <w:t>5</w:t>
+            </w:r>
+          </w:p>
+        </w:tc>
+      </w:tr>
+      <w:tr>
+        <w:tc>
+          <w:tcPr>
+            <w:tcW w:type="dxa" w:w="3009"/>
+          </w:tcPr>
+          <w:p>
+            <w:r>
+              <w:t>FR-13</w:t>
+            </w:r>
+          </w:p>
+        </w:tc>
+        <w:tc>
+          <w:tcPr>
+            <w:tcW w:type="dxa" w:w="3009"/>
+          </w:tcPr>
+          <w:p>
+            <w:r>
+              <w:t>As an external hotel site I sync bookings two-way with the PMS (HMAC)</w:t>
+            </w:r>
+          </w:p>
+        </w:tc>
+        <w:tc>
+          <w:tcPr>
+            <w:tcW w:type="dxa" w:w="3009"/>
+          </w:tcPr>
+          <w:p>
+            <w:r>
+              <w:t>13</w:t>
+            </w:r>
+          </w:p>
+        </w:tc>
+      </w:tr>
+      <w:tr>
+        <w:tc>
+          <w:tcPr>
+            <w:tcW w:type="dxa" w:w="3009"/>
+          </w:tcPr>
+          <w:p>
+            <w:r>
+              <w:t>FR-14</w:t>
+            </w:r>
+          </w:p>
+        </w:tc>
+        <w:tc>
+          <w:tcPr>
+            <w:tcW w:type="dxa" w:w="3009"/>
+          </w:tcPr>
+          <w:p>
+            <w:r>
+              <w:t>As a manager I view occupancy/RevPAR/loyalty dashboards</w:t>
+            </w:r>
+          </w:p>
+        </w:tc>
+        <w:tc>
+          <w:tcPr>
+            <w:tcW w:type="dxa" w:w="3009"/>
+          </w:tcPr>
+          <w:p>
+            <w:r>
+              <w:t>8</w:t>
+            </w:r>
+          </w:p>
+        </w:tc>
+      </w:tr>
+    </w:tbl>
+    <w:p/>
     <w:p>
       <w:pPr>
         <w:pStyle w:val="1"/>
@@ -2930,7 +3443,7 @@
           </w:tcPr>
           <w:p>
             <w:r>
-              <w:t>JWT (python-jose), bcrypt/passlib, HMAC OTP</w:t>
+              <w:t>JWT (python-jose), bcrypt/passlib, HMAC email-OTP</w:t>
             </w:r>
           </w:p>
         </w:tc>
@@ -2952,7 +3465,7 @@
           </w:tcPr>
           <w:p>
             <w:r>
-              <w:t>SQLAlchemy, raw SQL migrations + startup bootstrap</w:t>
+              <w:t>SQLAlchemy; raw-SQL migrations + startup bootstrap (no Alembic in use)</w:t>
             </w:r>
           </w:p>
         </w:tc>
@@ -2974,7 +3487,7 @@
           </w:tcPr>
           <w:p>
             <w:r>
-              <w:t>PostgreSQL 15 (prod), SQLite (tests), DuckDB (dbt local)</w:t>
+              <w:t>PostgreSQL 15 (prod), SQLite (unit tests), DuckDB (dbt local)</w:t>
             </w:r>
           </w:p>
         </w:tc>
@@ -3106,7 +3619,29 @@
           </w:tcPr>
           <w:p>
             <w:r>
-              <w:t>React 19, TypeScript, Vite, Zustand, React Router</w:t>
+              <w:t>React 19, TypeScript, Vite</w:t>
+            </w:r>
+          </w:p>
+        </w:tc>
+      </w:tr>
+      <w:tr>
+        <w:tc>
+          <w:tcPr>
+            <w:tcW w:type="dxa" w:w="4513"/>
+          </w:tcPr>
+          <w:p>
+            <w:r>
+              <w:t>FE state / routing / styling</w:t>
+            </w:r>
+          </w:p>
+        </w:tc>
+        <w:tc>
+          <w:tcPr>
+            <w:tcW w:type="dxa" w:w="4513"/>
+          </w:tcPr>
+          <w:p>
+            <w:r>
+              <w:t>Zustand, React Router v6, Tailwind CSS</w:t>
             </w:r>
           </w:p>
         </w:tc>

</xml_diff>

<commit_message>
docs(report): TOC, traceability matrix, NFR table, extra diagrams, conclusion
- auto Table of Contents (Word field) + chapter 12 Conclusion & Future Work (links open issues)
- requirements traceability matrix (FR -> sprint -> test -> owner); NFR as a table
- new diagrams: sprint Gantt, Stripe sequence, booking + housekeeping state machines, dbt lineage
- numbered table captions throughout
Report now: 12 chapters + TOC, 18 diagrams, 14 tables.
</commit_message>
<xml_diff>
--- a/docs/report/NextStay_Report.docx
+++ b/docs/report/NextStay_Report.docx
@@ -74,6 +74,28 @@
         <w:pStyle w:val="1"/>
       </w:pPr>
       <w:r>
+        <w:t>Table of Contents</w:t>
+      </w:r>
+    </w:p>
+    <w:p>
+      <w:r>
+        <w:fldChar w:fldCharType="begin"/>
+        <w:instrText xml:space="preserve">TOC \o "1-2" \h \z \u</w:instrText>
+        <w:fldChar w:fldCharType="separate"/>
+        <w:t>Right-click → Update Field to build the contents.</w:t>
+        <w:fldChar w:fldCharType="end"/>
+      </w:r>
+    </w:p>
+    <w:p>
+      <w:r>
+        <w:br w:type="page"/>
+      </w:r>
+    </w:p>
+    <w:p>
+      <w:pPr>
+        <w:pStyle w:val="1"/>
+      </w:pPr>
+      <w:r>
         <w:t>1. Introduction</w:t>
       </w:r>
     </w:p>
@@ -203,6 +225,15 @@
       </w:pPr>
       <w:r>
         <w:t>3.1 Functional Requirements</w:t>
+      </w:r>
+    </w:p>
+    <w:p>
+      <w:r>
+        <w:rPr>
+          <w:i/>
+          <w:sz w:val="18"/>
+        </w:rPr>
+        <w:t>Table 1 — Functional requirements (FR-1…FR-14).</w:t>
       </w:r>
     </w:p>
     <w:tbl>
@@ -728,126 +759,11 @@
     </w:p>
     <w:p>
       <w:r>
-        <w:t>Security: JWT sessions with JTI revocation, email-OTP, HMAC-signed sync webhooks, role-gated APIs.</w:t>
-      </w:r>
-    </w:p>
-    <w:p>
-      <w:r>
-        <w:t>•  Security: JWT sessions with JTI revocation, email-OTP, HMAC-signed sync webhooks, role-gated APIs.</w:t>
-      </w:r>
-    </w:p>
-    <w:p>
-      <w:r>
-        <w:t>Performance: asynchronous pricing pipeline; indexed availability and payment lookups.</w:t>
-      </w:r>
-    </w:p>
-    <w:p>
-      <w:r>
-        <w:t>•  Performance: asynchronous pricing pipeline; indexed availability and payment lookups.</w:t>
-      </w:r>
-    </w:p>
-    <w:p>
-      <w:r>
-        <w:t>Usability: role-gated UI; token-only guest access without an account.</w:t>
-      </w:r>
-    </w:p>
-    <w:p>
-      <w:r>
-        <w:t>•  Usability: role-gated UI; token-only guest access without an account.</w:t>
-      </w:r>
-    </w:p>
-    <w:p>
-      <w:r>
-        <w:t>Maintainability: modular FastAPI routers, component-based frontend, dbt-managed warehouse, IaC via Docker Compose.</w:t>
-      </w:r>
-    </w:p>
-    <w:p>
-      <w:r>
-        <w:t>•  Maintainability: modular FastAPI routers, component-based frontend, dbt-managed warehouse, IaC via Docker Compose.</w:t>
-      </w:r>
-    </w:p>
-    <w:p>
-      <w:r>
-        <w:t>Portability: SQL kept ANSI-compatible so dbt models run on both DuckDB (local) and PostgreSQL (prod).</w:t>
-      </w:r>
-    </w:p>
-    <w:p>
-      <w:r>
-        <w:t>•  Portability: SQL kept ANSI-compatible so dbt models run on both DuckDB (local) and PostgreSQL (prod).</w:t>
-      </w:r>
-    </w:p>
-    <w:p>
-      <w:pPr>
-        <w:pStyle w:val="1"/>
-      </w:pPr>
-      <w:r>
-        <w:t>4. Before Sprints</w:t>
-      </w:r>
-    </w:p>
-    <w:p>
-      <w:pPr>
-        <w:pStyle w:val="2"/>
-      </w:pPr>
-      <w:r>
-        <w:t>4.1 Definition of Done</w:t>
-      </w:r>
-    </w:p>
-    <w:p>
-      <w:r>
-        <w:t>Code merged to main via pull request.</w:t>
-      </w:r>
-    </w:p>
-    <w:p>
-      <w:r>
-        <w:t>•  Code merged to main via pull request.</w:t>
-      </w:r>
-    </w:p>
-    <w:p>
-      <w:r>
-        <w:t>No Ruff/SQLFluff lint errors (enforced by pre-commit + CI).</w:t>
-      </w:r>
-    </w:p>
-    <w:p>
-      <w:r>
-        <w:t>•  No Ruff/SQLFluff lint errors (enforced by pre-commit + CI).</w:t>
-      </w:r>
-    </w:p>
-    <w:p>
-      <w:r>
-        <w:t>Endpoints return the expected HTTP status codes; automated tests pass.</w:t>
-      </w:r>
-    </w:p>
-    <w:p>
-      <w:r>
-        <w:t>•  Endpoints return the expected HTTP status codes; automated tests pass.</w:t>
-      </w:r>
-    </w:p>
-    <w:p>
-      <w:r>
-        <w:t>UI renders without console errors.</w:t>
-      </w:r>
-    </w:p>
-    <w:p>
-      <w:r>
-        <w:t>•  UI renders without console errors.</w:t>
-      </w:r>
-    </w:p>
-    <w:p>
-      <w:r>
-        <w:t>Feature manually tested end-to-end.</w:t>
-      </w:r>
-    </w:p>
-    <w:p>
-      <w:r>
-        <w:t>•  Feature manually tested end-to-end.</w:t>
-      </w:r>
-    </w:p>
-    <w:p>
-      <w:pPr>
-        <w:pStyle w:val="2"/>
-      </w:pPr>
-      <w:r>
-        <w:t>4.2 Sprint Calendar</w:t>
+        <w:rPr>
+          <w:i/>
+          <w:sz w:val="18"/>
+        </w:rPr>
+        <w:t>Table 2 — Non-functional requirements.</w:t>
       </w:r>
     </w:p>
     <w:tbl>
@@ -880,7 +796,7 @@
               <w:rPr>
                 <w:b/>
               </w:rPr>
-              <w:t>Sprint</w:t>
+              <w:t>NFR</w:t>
             </w:r>
           </w:p>
         </w:tc>
@@ -894,7 +810,7 @@
               <w:rPr>
                 <w:b/>
               </w:rPr>
-              <w:t>Theme</w:t>
+              <w:t>Category</w:t>
             </w:r>
           </w:p>
         </w:tc>
@@ -908,7 +824,7 @@
               <w:rPr>
                 <w:b/>
               </w:rPr>
-              <w:t>Length</w:t>
+              <w:t>Requirement</w:t>
             </w:r>
           </w:p>
         </w:tc>
@@ -920,27 +836,27 @@
           </w:tcPr>
           <w:p>
             <w:r>
-              <w:t>Sprint 1</w:t>
-            </w:r>
-          </w:p>
-        </w:tc>
-        <w:tc>
-          <w:tcPr>
-            <w:tcW w:type="dxa" w:w="3009"/>
-          </w:tcPr>
-          <w:p>
-            <w:r>
-              <w:t>Auth &amp; User Foundation</w:t>
-            </w:r>
-          </w:p>
-        </w:tc>
-        <w:tc>
-          <w:tcPr>
-            <w:tcW w:type="dxa" w:w="3009"/>
-          </w:tcPr>
-          <w:p>
-            <w:r>
-              <w:t>~10 days</w:t>
+              <w:t>NFR-1</w:t>
+            </w:r>
+          </w:p>
+        </w:tc>
+        <w:tc>
+          <w:tcPr>
+            <w:tcW w:type="dxa" w:w="3009"/>
+          </w:tcPr>
+          <w:p>
+            <w:r>
+              <w:t>Security</w:t>
+            </w:r>
+          </w:p>
+        </w:tc>
+        <w:tc>
+          <w:tcPr>
+            <w:tcW w:type="dxa" w:w="3009"/>
+          </w:tcPr>
+          <w:p>
+            <w:r>
+              <w:t>JWT with JTI revocation, email-OTP, HMAC-signed sync webhooks, role-gated APIs</w:t>
             </w:r>
           </w:p>
         </w:tc>
@@ -952,27 +868,27 @@
           </w:tcPr>
           <w:p>
             <w:r>
-              <w:t>Sprint 2</w:t>
-            </w:r>
-          </w:p>
-        </w:tc>
-        <w:tc>
-          <w:tcPr>
-            <w:tcW w:type="dxa" w:w="3009"/>
-          </w:tcPr>
-          <w:p>
-            <w:r>
-              <w:t>Rooms, Inventory &amp; Booking Core</w:t>
-            </w:r>
-          </w:p>
-        </w:tc>
-        <w:tc>
-          <w:tcPr>
-            <w:tcW w:type="dxa" w:w="3009"/>
-          </w:tcPr>
-          <w:p>
-            <w:r>
-              <w:t>~10 days</w:t>
+              <w:t>NFR-2</w:t>
+            </w:r>
+          </w:p>
+        </w:tc>
+        <w:tc>
+          <w:tcPr>
+            <w:tcW w:type="dxa" w:w="3009"/>
+          </w:tcPr>
+          <w:p>
+            <w:r>
+              <w:t>Performance</w:t>
+            </w:r>
+          </w:p>
+        </w:tc>
+        <w:tc>
+          <w:tcPr>
+            <w:tcW w:type="dxa" w:w="3009"/>
+          </w:tcPr>
+          <w:p>
+            <w:r>
+              <w:t>Asynchronous pricing pipeline; indexed availability and payment lookups</w:t>
             </w:r>
           </w:p>
         </w:tc>
@@ -984,27 +900,27 @@
           </w:tcPr>
           <w:p>
             <w:r>
-              <w:t>Sprint 3</w:t>
-            </w:r>
-          </w:p>
-        </w:tc>
-        <w:tc>
-          <w:tcPr>
-            <w:tcW w:type="dxa" w:w="3009"/>
-          </w:tcPr>
-          <w:p>
-            <w:r>
-              <w:t>Pricing Engine (ML)</w:t>
-            </w:r>
-          </w:p>
-        </w:tc>
-        <w:tc>
-          <w:tcPr>
-            <w:tcW w:type="dxa" w:w="3009"/>
-          </w:tcPr>
-          <w:p>
-            <w:r>
-              <w:t>~12 days</w:t>
+              <w:t>NFR-3</w:t>
+            </w:r>
+          </w:p>
+        </w:tc>
+        <w:tc>
+          <w:tcPr>
+            <w:tcW w:type="dxa" w:w="3009"/>
+          </w:tcPr>
+          <w:p>
+            <w:r>
+              <w:t>Usability</w:t>
+            </w:r>
+          </w:p>
+        </w:tc>
+        <w:tc>
+          <w:tcPr>
+            <w:tcW w:type="dxa" w:w="3009"/>
+          </w:tcPr>
+          <w:p>
+            <w:r>
+              <w:t>Role-gated UI; token-only guest access without an account</w:t>
             </w:r>
           </w:p>
         </w:tc>
@@ -1016,27 +932,27 @@
           </w:tcPr>
           <w:p>
             <w:r>
-              <w:t>Sprint 4</w:t>
-            </w:r>
-          </w:p>
-        </w:tc>
-        <w:tc>
-          <w:tcPr>
-            <w:tcW w:type="dxa" w:w="3009"/>
-          </w:tcPr>
-          <w:p>
-            <w:r>
-              <w:t>Staff, Shifts &amp; Task Management</w:t>
-            </w:r>
-          </w:p>
-        </w:tc>
-        <w:tc>
-          <w:tcPr>
-            <w:tcW w:type="dxa" w:w="3009"/>
-          </w:tcPr>
-          <w:p>
-            <w:r>
-              <w:t>~10 days</w:t>
+              <w:t>NFR-4</w:t>
+            </w:r>
+          </w:p>
+        </w:tc>
+        <w:tc>
+          <w:tcPr>
+            <w:tcW w:type="dxa" w:w="3009"/>
+          </w:tcPr>
+          <w:p>
+            <w:r>
+              <w:t>Maintainability</w:t>
+            </w:r>
+          </w:p>
+        </w:tc>
+        <w:tc>
+          <w:tcPr>
+            <w:tcW w:type="dxa" w:w="3009"/>
+          </w:tcPr>
+          <w:p>
+            <w:r>
+              <w:t>Modular FastAPI routers, component-based FE, dbt warehouse, IaC via Compose</w:t>
             </w:r>
           </w:p>
         </w:tc>
@@ -1048,27 +964,27 @@
           </w:tcPr>
           <w:p>
             <w:r>
-              <w:t>Sprint 5</w:t>
-            </w:r>
-          </w:p>
-        </w:tc>
-        <w:tc>
-          <w:tcPr>
-            <w:tcW w:type="dxa" w:w="3009"/>
-          </w:tcPr>
-          <w:p>
-            <w:r>
-              <w:t>Payments, Guest Portal &amp; Polish</w:t>
-            </w:r>
-          </w:p>
-        </w:tc>
-        <w:tc>
-          <w:tcPr>
-            <w:tcW w:type="dxa" w:w="3009"/>
-          </w:tcPr>
-          <w:p>
-            <w:r>
-              <w:t>~10 days</w:t>
+              <w:t>NFR-5</w:t>
+            </w:r>
+          </w:p>
+        </w:tc>
+        <w:tc>
+          <w:tcPr>
+            <w:tcW w:type="dxa" w:w="3009"/>
+          </w:tcPr>
+          <w:p>
+            <w:r>
+              <w:t>Portability</w:t>
+            </w:r>
+          </w:p>
+        </w:tc>
+        <w:tc>
+          <w:tcPr>
+            <w:tcW w:type="dxa" w:w="3009"/>
+          </w:tcPr>
+          <w:p>
+            <w:r>
+              <w:t>ANSI-compatible SQL — dbt runs on DuckDB (local) and PostgreSQL (prod)</w:t>
             </w:r>
           </w:p>
         </w:tc>
@@ -1080,27 +996,27 @@
           </w:tcPr>
           <w:p>
             <w:r>
-              <w:t>Post-MVP</w:t>
-            </w:r>
-          </w:p>
-        </w:tc>
-        <w:tc>
-          <w:tcPr>
-            <w:tcW w:type="dxa" w:w="3009"/>
-          </w:tcPr>
-          <w:p>
-            <w:r>
-              <w:t>Hotel-Sync Simulator, DWH, Airflow, Superset</w:t>
-            </w:r>
-          </w:p>
-        </w:tc>
-        <w:tc>
-          <w:tcPr>
-            <w:tcW w:type="dxa" w:w="3009"/>
-          </w:tcPr>
-          <w:p>
-            <w:r>
-              <w:t>~10 days</w:t>
+              <w:t>NFR-6</w:t>
+            </w:r>
+          </w:p>
+        </w:tc>
+        <w:tc>
+          <w:tcPr>
+            <w:tcW w:type="dxa" w:w="3009"/>
+          </w:tcPr>
+          <w:p>
+            <w:r>
+              <w:t>Testability</w:t>
+            </w:r>
+          </w:p>
+        </w:tc>
+        <w:tc>
+          <w:tcPr>
+            <w:tcW w:type="dxa" w:w="3009"/>
+          </w:tcPr>
+          <w:p>
+            <w:r>
+              <w:t>4-layer test pyramid (unit/integration/data/system), 167 automated checks</w:t>
             </w:r>
           </w:p>
         </w:tc>
@@ -1109,15 +1025,85 @@
     <w:p/>
     <w:p>
       <w:pPr>
+        <w:pStyle w:val="1"/>
+      </w:pPr>
+      <w:r>
+        <w:t>4. Before Sprints</w:t>
+      </w:r>
+    </w:p>
+    <w:p>
+      <w:pPr>
         <w:pStyle w:val="2"/>
       </w:pPr>
       <w:r>
-        <w:t>4.3 Product Backlog</w:t>
-      </w:r>
-    </w:p>
-    <w:p>
-      <w:r>
-        <w:t>User stories derived from FR-1…FR-14, estimated in story points (SP).</w:t>
+        <w:t>4.1 Definition of Done</w:t>
+      </w:r>
+    </w:p>
+    <w:p>
+      <w:r>
+        <w:t>Code merged to main via pull request.</w:t>
+      </w:r>
+    </w:p>
+    <w:p>
+      <w:r>
+        <w:t>•  Code merged to main via pull request.</w:t>
+      </w:r>
+    </w:p>
+    <w:p>
+      <w:r>
+        <w:t>No Ruff/SQLFluff lint errors (enforced by pre-commit + CI).</w:t>
+      </w:r>
+    </w:p>
+    <w:p>
+      <w:r>
+        <w:t>•  No Ruff/SQLFluff lint errors (enforced by pre-commit + CI).</w:t>
+      </w:r>
+    </w:p>
+    <w:p>
+      <w:r>
+        <w:t>Endpoints return the expected HTTP status codes; automated tests pass.</w:t>
+      </w:r>
+    </w:p>
+    <w:p>
+      <w:r>
+        <w:t>•  Endpoints return the expected HTTP status codes; automated tests pass.</w:t>
+      </w:r>
+    </w:p>
+    <w:p>
+      <w:r>
+        <w:t>UI renders without console errors.</w:t>
+      </w:r>
+    </w:p>
+    <w:p>
+      <w:r>
+        <w:t>•  UI renders without console errors.</w:t>
+      </w:r>
+    </w:p>
+    <w:p>
+      <w:r>
+        <w:t>Feature manually tested end-to-end.</w:t>
+      </w:r>
+    </w:p>
+    <w:p>
+      <w:r>
+        <w:t>•  Feature manually tested end-to-end.</w:t>
+      </w:r>
+    </w:p>
+    <w:p>
+      <w:pPr>
+        <w:pStyle w:val="2"/>
+      </w:pPr>
+      <w:r>
+        <w:t>4.2 Sprint Calendar</w:t>
+      </w:r>
+    </w:p>
+    <w:p>
+      <w:r>
+        <w:rPr>
+          <w:i/>
+          <w:sz w:val="18"/>
+        </w:rPr>
+        <w:t>Table 3 — Sprint calendar.</w:t>
       </w:r>
     </w:p>
     <w:tbl>
@@ -1150,7 +1136,7 @@
               <w:rPr>
                 <w:b/>
               </w:rPr>
-              <w:t>FR</w:t>
+              <w:t>Sprint</w:t>
             </w:r>
           </w:p>
         </w:tc>
@@ -1164,7 +1150,7 @@
               <w:rPr>
                 <w:b/>
               </w:rPr>
-              <w:t>User story</w:t>
+              <w:t>Theme</w:t>
             </w:r>
           </w:p>
         </w:tc>
@@ -1178,7 +1164,7 @@
               <w:rPr>
                 <w:b/>
               </w:rPr>
-              <w:t>SP</w:t>
+              <w:t>Length</w:t>
             </w:r>
           </w:p>
         </w:tc>
@@ -1190,27 +1176,27 @@
           </w:tcPr>
           <w:p>
             <w:r>
-              <w:t>FR-1</w:t>
-            </w:r>
-          </w:p>
-        </w:tc>
-        <w:tc>
-          <w:tcPr>
-            <w:tcW w:type="dxa" w:w="3009"/>
-          </w:tcPr>
-          <w:p>
-            <w:r>
-              <w:t>As a user I log in via email OTP and receive a JWT so access is secure</w:t>
-            </w:r>
-          </w:p>
-        </w:tc>
-        <w:tc>
-          <w:tcPr>
-            <w:tcW w:type="dxa" w:w="3009"/>
-          </w:tcPr>
-          <w:p>
-            <w:r>
-              <w:t>5</w:t>
+              <w:t>Sprint 1</w:t>
+            </w:r>
+          </w:p>
+        </w:tc>
+        <w:tc>
+          <w:tcPr>
+            <w:tcW w:type="dxa" w:w="3009"/>
+          </w:tcPr>
+          <w:p>
+            <w:r>
+              <w:t>Auth &amp; User Foundation</w:t>
+            </w:r>
+          </w:p>
+        </w:tc>
+        <w:tc>
+          <w:tcPr>
+            <w:tcW w:type="dxa" w:w="3009"/>
+          </w:tcPr>
+          <w:p>
+            <w:r>
+              <w:t>~10 days</w:t>
             </w:r>
           </w:p>
         </w:tc>
@@ -1222,27 +1208,27 @@
           </w:tcPr>
           <w:p>
             <w:r>
-              <w:t>FR-2</w:t>
-            </w:r>
-          </w:p>
-        </w:tc>
-        <w:tc>
-          <w:tcPr>
-            <w:tcW w:type="dxa" w:w="3009"/>
-          </w:tcPr>
-          <w:p>
-            <w:r>
-              <w:t>As an admin I have role-based access so permissions are enforced</w:t>
-            </w:r>
-          </w:p>
-        </w:tc>
-        <w:tc>
-          <w:tcPr>
-            <w:tcW w:type="dxa" w:w="3009"/>
-          </w:tcPr>
-          <w:p>
-            <w:r>
-              <w:t>3</w:t>
+              <w:t>Sprint 2</w:t>
+            </w:r>
+          </w:p>
+        </w:tc>
+        <w:tc>
+          <w:tcPr>
+            <w:tcW w:type="dxa" w:w="3009"/>
+          </w:tcPr>
+          <w:p>
+            <w:r>
+              <w:t>Rooms, Inventory &amp; Booking Core</w:t>
+            </w:r>
+          </w:p>
+        </w:tc>
+        <w:tc>
+          <w:tcPr>
+            <w:tcW w:type="dxa" w:w="3009"/>
+          </w:tcPr>
+          <w:p>
+            <w:r>
+              <w:t>~10 days</w:t>
             </w:r>
           </w:p>
         </w:tc>
@@ -1254,27 +1240,27 @@
           </w:tcPr>
           <w:p>
             <w:r>
-              <w:t>FR-3</w:t>
-            </w:r>
-          </w:p>
-        </w:tc>
-        <w:tc>
-          <w:tcPr>
-            <w:tcW w:type="dxa" w:w="3009"/>
-          </w:tcPr>
-          <w:p>
-            <w:r>
-              <w:t>As staff I create/read/update/delete rooms and set up inventory</w:t>
-            </w:r>
-          </w:p>
-        </w:tc>
-        <w:tc>
-          <w:tcPr>
-            <w:tcW w:type="dxa" w:w="3009"/>
-          </w:tcPr>
-          <w:p>
-            <w:r>
-              <w:t>5</w:t>
+              <w:t>Sprint 3</w:t>
+            </w:r>
+          </w:p>
+        </w:tc>
+        <w:tc>
+          <w:tcPr>
+            <w:tcW w:type="dxa" w:w="3009"/>
+          </w:tcPr>
+          <w:p>
+            <w:r>
+              <w:t>Pricing Engine (ML)</w:t>
+            </w:r>
+          </w:p>
+        </w:tc>
+        <w:tc>
+          <w:tcPr>
+            <w:tcW w:type="dxa" w:w="3009"/>
+          </w:tcPr>
+          <w:p>
+            <w:r>
+              <w:t>~12 days</w:t>
             </w:r>
           </w:p>
         </w:tc>
@@ -1286,27 +1272,27 @@
           </w:tcPr>
           <w:p>
             <w:r>
-              <w:t>FR-4</w:t>
-            </w:r>
-          </w:p>
-        </w:tc>
-        <w:tc>
-          <w:tcPr>
-            <w:tcW w:type="dxa" w:w="3009"/>
-          </w:tcPr>
-          <w:p>
-            <w:r>
-              <w:t>As a guest I check availability and hold a room before paying</w:t>
-            </w:r>
-          </w:p>
-        </w:tc>
-        <w:tc>
-          <w:tcPr>
-            <w:tcW w:type="dxa" w:w="3009"/>
-          </w:tcPr>
-          <w:p>
-            <w:r>
-              <w:t>8</w:t>
+              <w:t>Sprint 4</w:t>
+            </w:r>
+          </w:p>
+        </w:tc>
+        <w:tc>
+          <w:tcPr>
+            <w:tcW w:type="dxa" w:w="3009"/>
+          </w:tcPr>
+          <w:p>
+            <w:r>
+              <w:t>Staff, Shifts &amp; Task Management</w:t>
+            </w:r>
+          </w:p>
+        </w:tc>
+        <w:tc>
+          <w:tcPr>
+            <w:tcW w:type="dxa" w:w="3009"/>
+          </w:tcPr>
+          <w:p>
+            <w:r>
+              <w:t>~10 days</w:t>
             </w:r>
           </w:p>
         </w:tc>
@@ -1318,27 +1304,27 @@
           </w:tcPr>
           <w:p>
             <w:r>
-              <w:t>FR-5</w:t>
-            </w:r>
-          </w:p>
-        </w:tc>
-        <w:tc>
-          <w:tcPr>
-            <w:tcW w:type="dxa" w:w="3009"/>
-          </w:tcPr>
-          <w:p>
-            <w:r>
-              <w:t>As a guest I pay via Stripe so my booking is confirmed</w:t>
-            </w:r>
-          </w:p>
-        </w:tc>
-        <w:tc>
-          <w:tcPr>
-            <w:tcW w:type="dxa" w:w="3009"/>
-          </w:tcPr>
-          <w:p>
-            <w:r>
-              <w:t>8</w:t>
+              <w:t>Sprint 5</w:t>
+            </w:r>
+          </w:p>
+        </w:tc>
+        <w:tc>
+          <w:tcPr>
+            <w:tcW w:type="dxa" w:w="3009"/>
+          </w:tcPr>
+          <w:p>
+            <w:r>
+              <w:t>Payments, Guest Portal &amp; Polish</w:t>
+            </w:r>
+          </w:p>
+        </w:tc>
+        <w:tc>
+          <w:tcPr>
+            <w:tcW w:type="dxa" w:w="3009"/>
+          </w:tcPr>
+          <w:p>
+            <w:r>
+              <w:t>~10 days</w:t>
             </w:r>
           </w:p>
         </w:tc>
@@ -1350,283 +1336,27 @@
           </w:tcPr>
           <w:p>
             <w:r>
-              <w:t>FR-6</w:t>
-            </w:r>
-          </w:p>
-        </w:tc>
-        <w:tc>
-          <w:tcPr>
-            <w:tcW w:type="dxa" w:w="3009"/>
-          </w:tcPr>
-          <w:p>
-            <w:r>
-              <w:t>As an owner I train a per-hotel model and publish dynamic prices</w:t>
-            </w:r>
-          </w:p>
-        </w:tc>
-        <w:tc>
-          <w:tcPr>
-            <w:tcW w:type="dxa" w:w="3009"/>
-          </w:tcPr>
-          <w:p>
-            <w:r>
-              <w:t>13</w:t>
-            </w:r>
-          </w:p>
-        </w:tc>
-      </w:tr>
-      <w:tr>
-        <w:tc>
-          <w:tcPr>
-            <w:tcW w:type="dxa" w:w="3009"/>
-          </w:tcPr>
-          <w:p>
-            <w:r>
-              <w:t>FR-7</w:t>
-            </w:r>
-          </w:p>
-        </w:tc>
-        <w:tc>
-          <w:tcPr>
-            <w:tcW w:type="dxa" w:w="3009"/>
-          </w:tcPr>
-          <w:p>
-            <w:r>
-              <w:t>As a manager I schedule shifts and auto-assign housekeeping tasks</w:t>
-            </w:r>
-          </w:p>
-        </w:tc>
-        <w:tc>
-          <w:tcPr>
-            <w:tcW w:type="dxa" w:w="3009"/>
-          </w:tcPr>
-          <w:p>
-            <w:r>
-              <w:t>8</w:t>
-            </w:r>
-          </w:p>
-        </w:tc>
-      </w:tr>
-      <w:tr>
-        <w:tc>
-          <w:tcPr>
-            <w:tcW w:type="dxa" w:w="3009"/>
-          </w:tcPr>
-          <w:p>
-            <w:r>
-              <w:t>FR-8</w:t>
-            </w:r>
-          </w:p>
-        </w:tc>
-        <w:tc>
-          <w:tcPr>
-            <w:tcW w:type="dxa" w:w="3009"/>
-          </w:tcPr>
-          <w:p>
-            <w:r>
-              <w:t>As an admin I see a dashboard with KPIs and quick links</w:t>
-            </w:r>
-          </w:p>
-        </w:tc>
-        <w:tc>
-          <w:tcPr>
-            <w:tcW w:type="dxa" w:w="3009"/>
-          </w:tcPr>
-          <w:p>
-            <w:r>
-              <w:t>5</w:t>
-            </w:r>
-          </w:p>
-        </w:tc>
-      </w:tr>
-      <w:tr>
-        <w:tc>
-          <w:tcPr>
-            <w:tcW w:type="dxa" w:w="3009"/>
-          </w:tcPr>
-          <w:p>
-            <w:r>
-              <w:t>FR-9</w:t>
-            </w:r>
-          </w:p>
-        </w:tc>
-        <w:tc>
-          <w:tcPr>
-            <w:tcW w:type="dxa" w:w="3009"/>
-          </w:tcPr>
-          <w:p>
-            <w:r>
-              <w:t>As a guest I access my stay details by token without logging in</w:t>
-            </w:r>
-          </w:p>
-        </w:tc>
-        <w:tc>
-          <w:tcPr>
-            <w:tcW w:type="dxa" w:w="3009"/>
-          </w:tcPr>
-          <w:p>
-            <w:r>
-              <w:t>5</w:t>
-            </w:r>
-          </w:p>
-        </w:tc>
-      </w:tr>
-      <w:tr>
-        <w:tc>
-          <w:tcPr>
-            <w:tcW w:type="dxa" w:w="3009"/>
-          </w:tcPr>
-          <w:p>
-            <w:r>
-              <w:t>FR-10</w:t>
-            </w:r>
-          </w:p>
-        </w:tc>
-        <w:tc>
-          <w:tcPr>
-            <w:tcW w:type="dxa" w:w="3009"/>
-          </w:tcPr>
-          <w:p>
-            <w:r>
-              <w:t>As a guest I complete booking with success/cancel pages</w:t>
-            </w:r>
-          </w:p>
-        </w:tc>
-        <w:tc>
-          <w:tcPr>
-            <w:tcW w:type="dxa" w:w="3009"/>
-          </w:tcPr>
-          <w:p>
-            <w:r>
-              <w:t>3</w:t>
-            </w:r>
-          </w:p>
-        </w:tc>
-      </w:tr>
-      <w:tr>
-        <w:tc>
-          <w:tcPr>
-            <w:tcW w:type="dxa" w:w="3009"/>
-          </w:tcPr>
-          <w:p>
-            <w:r>
-              <w:t>FR-11</w:t>
-            </w:r>
-          </w:p>
-        </w:tc>
-        <w:tc>
-          <w:tcPr>
-            <w:tcW w:type="dxa" w:w="3009"/>
-          </w:tcPr>
-          <w:p>
-            <w:r>
-              <w:t>As staff I start my shift and see my assigned tasks</w:t>
-            </w:r>
-          </w:p>
-        </w:tc>
-        <w:tc>
-          <w:tcPr>
-            <w:tcW w:type="dxa" w:w="3009"/>
-          </w:tcPr>
-          <w:p>
-            <w:r>
-              <w:t>5</w:t>
-            </w:r>
-          </w:p>
-        </w:tc>
-      </w:tr>
-      <w:tr>
-        <w:tc>
-          <w:tcPr>
-            <w:tcW w:type="dxa" w:w="3009"/>
-          </w:tcPr>
-          <w:p>
-            <w:r>
-              <w:t>FR-12</w:t>
-            </w:r>
-          </w:p>
-        </w:tc>
-        <w:tc>
-          <w:tcPr>
-            <w:tcW w:type="dxa" w:w="3009"/>
-          </w:tcPr>
-          <w:p>
-            <w:r>
-              <w:t>As a manager I view bookings/revenue reports</w:t>
-            </w:r>
-          </w:p>
-        </w:tc>
-        <w:tc>
-          <w:tcPr>
-            <w:tcW w:type="dxa" w:w="3009"/>
-          </w:tcPr>
-          <w:p>
-            <w:r>
-              <w:t>5</w:t>
-            </w:r>
-          </w:p>
-        </w:tc>
-      </w:tr>
-      <w:tr>
-        <w:tc>
-          <w:tcPr>
-            <w:tcW w:type="dxa" w:w="3009"/>
-          </w:tcPr>
-          <w:p>
-            <w:r>
-              <w:t>FR-13</w:t>
-            </w:r>
-          </w:p>
-        </w:tc>
-        <w:tc>
-          <w:tcPr>
-            <w:tcW w:type="dxa" w:w="3009"/>
-          </w:tcPr>
-          <w:p>
-            <w:r>
-              <w:t>As an external hotel site I sync bookings two-way with the PMS (HMAC)</w:t>
-            </w:r>
-          </w:p>
-        </w:tc>
-        <w:tc>
-          <w:tcPr>
-            <w:tcW w:type="dxa" w:w="3009"/>
-          </w:tcPr>
-          <w:p>
-            <w:r>
-              <w:t>13</w:t>
-            </w:r>
-          </w:p>
-        </w:tc>
-      </w:tr>
-      <w:tr>
-        <w:tc>
-          <w:tcPr>
-            <w:tcW w:type="dxa" w:w="3009"/>
-          </w:tcPr>
-          <w:p>
-            <w:r>
-              <w:t>FR-14</w:t>
-            </w:r>
-          </w:p>
-        </w:tc>
-        <w:tc>
-          <w:tcPr>
-            <w:tcW w:type="dxa" w:w="3009"/>
-          </w:tcPr>
-          <w:p>
-            <w:r>
-              <w:t>As a manager I view occupancy/RevPAR/loyalty dashboards</w:t>
-            </w:r>
-          </w:p>
-        </w:tc>
-        <w:tc>
-          <w:tcPr>
-            <w:tcW w:type="dxa" w:w="3009"/>
-          </w:tcPr>
-          <w:p>
-            <w:r>
-              <w:t>8</w:t>
+              <w:t>Post-MVP</w:t>
+            </w:r>
+          </w:p>
+        </w:tc>
+        <w:tc>
+          <w:tcPr>
+            <w:tcW w:type="dxa" w:w="3009"/>
+          </w:tcPr>
+          <w:p>
+            <w:r>
+              <w:t>Hotel-Sync Simulator, DWH, Airflow, Superset</w:t>
+            </w:r>
+          </w:p>
+        </w:tc>
+        <w:tc>
+          <w:tcPr>
+            <w:tcW w:type="dxa" w:w="3009"/>
+          </w:tcPr>
+          <w:p>
+            <w:r>
+              <w:t>~10 days</w:t>
             </w:r>
           </w:p>
         </w:tc>
@@ -1635,23 +1365,76 @@
     <w:p/>
     <w:p>
       <w:pPr>
-        <w:pStyle w:val="1"/>
-      </w:pPr>
-      <w:r>
-        <w:t>5. Sprint Development &amp; Results</w:t>
-      </w:r>
-    </w:p>
+        <w:jc w:val="center"/>
+      </w:pPr>
+      <w:r>
+        <w:drawing>
+          <wp:inline xmlns:a="http://schemas.openxmlformats.org/drawingml/2006/main" xmlns:pic="http://schemas.openxmlformats.org/drawingml/2006/picture">
+            <wp:extent cx="5669280" cy="726525"/>
+            <wp:docPr id="1" name="Picture 1"/>
+            <wp:cNvGraphicFramePr>
+              <a:graphicFrameLocks noChangeAspect="1"/>
+            </wp:cNvGraphicFramePr>
+            <a:graphic>
+              <a:graphicData uri="http://schemas.openxmlformats.org/drawingml/2006/picture">
+                <pic:pic>
+                  <pic:nvPicPr>
+                    <pic:cNvPr id="0" name="08370bf04deb56d3.png"/>
+                    <pic:cNvPicPr/>
+                  </pic:nvPicPr>
+                  <pic:blipFill>
+                    <a:blip r:embed="rId13"/>
+                    <a:stretch>
+                      <a:fillRect/>
+                    </a:stretch>
+                  </pic:blipFill>
+                  <pic:spPr>
+                    <a:xfrm>
+                      <a:off x="0" y="0"/>
+                      <a:ext cx="5669280" cy="726525"/>
+                    </a:xfrm>
+                    <a:prstGeom prst="rect"/>
+                  </pic:spPr>
+                </pic:pic>
+              </a:graphicData>
+            </a:graphic>
+          </wp:inline>
+        </w:drawing>
+      </w:r>
+    </w:p>
+    <w:p>
+      <w:pPr>
+        <w:jc w:val="center"/>
+      </w:pPr>
+      <w:r>
+        <w:rPr>
+          <w:i/>
+          <w:sz w:val="18"/>
+        </w:rPr>
+        <w:t>Figure 4.1 — Sprint timeline (Gantt).</w:t>
+      </w:r>
+    </w:p>
+    <w:p/>
     <w:p>
       <w:pPr>
         <w:pStyle w:val="2"/>
       </w:pPr>
       <w:r>
-        <w:t>Sprint 1 — Auth &amp; User Foundation</w:t>
-      </w:r>
-    </w:p>
-    <w:p>
-      <w:r>
-        <w:t>Sprint goal: any user can log in via email OTP and receive a JWT that gates all subsequent pages.</w:t>
+        <w:t>4.3 Product Backlog</w:t>
+      </w:r>
+    </w:p>
+    <w:p>
+      <w:r>
+        <w:t>User stories derived from FR-1…FR-14, estimated in story points (SP).</w:t>
+      </w:r>
+    </w:p>
+    <w:p>
+      <w:r>
+        <w:rPr>
+          <w:i/>
+          <w:sz w:val="18"/>
+        </w:rPr>
+        <w:t>Table 4 — Product backlog — user stories and story points.</w:t>
       </w:r>
     </w:p>
     <w:tbl>
@@ -1684,7 +1467,7 @@
               <w:rPr>
                 <w:b/>
               </w:rPr>
-              <w:t>Task</w:t>
+              <w:t>FR</w:t>
             </w:r>
           </w:p>
         </w:tc>
@@ -1698,7 +1481,7 @@
               <w:rPr>
                 <w:b/>
               </w:rPr>
-              <w:t>Owner</w:t>
+              <w:t>User story</w:t>
             </w:r>
           </w:p>
         </w:tc>
@@ -1712,7 +1495,7 @@
               <w:rPr>
                 <w:b/>
               </w:rPr>
-              <w:t>Days</w:t>
+              <w:t>SP</w:t>
             </w:r>
           </w:p>
         </w:tc>
@@ -1724,27 +1507,27 @@
           </w:tcPr>
           <w:p>
             <w:r>
-              <w:t>[DB] users, auth_sessions, email_otp tables</w:t>
-            </w:r>
-          </w:p>
-        </w:tc>
-        <w:tc>
-          <w:tcPr>
-            <w:tcW w:type="dxa" w:w="3009"/>
-          </w:tcPr>
-          <w:p>
-            <w:r>
-              <w:t>Atai</w:t>
-            </w:r>
-          </w:p>
-        </w:tc>
-        <w:tc>
-          <w:tcPr>
-            <w:tcW w:type="dxa" w:w="3009"/>
-          </w:tcPr>
-          <w:p>
-            <w:r>
-              <w:t>2</w:t>
+              <w:t>FR-1</w:t>
+            </w:r>
+          </w:p>
+        </w:tc>
+        <w:tc>
+          <w:tcPr>
+            <w:tcW w:type="dxa" w:w="3009"/>
+          </w:tcPr>
+          <w:p>
+            <w:r>
+              <w:t>As a user I log in via email OTP and receive a JWT so access is secure</w:t>
+            </w:r>
+          </w:p>
+        </w:tc>
+        <w:tc>
+          <w:tcPr>
+            <w:tcW w:type="dxa" w:w="3009"/>
+          </w:tcPr>
+          <w:p>
+            <w:r>
+              <w:t>5</w:t>
             </w:r>
           </w:p>
         </w:tc>
@@ -1756,27 +1539,27 @@
           </w:tcPr>
           <w:p>
             <w:r>
-              <w:t>[DB] SQLAlchemy models: User, AuthSession, EmailOtp</w:t>
-            </w:r>
-          </w:p>
-        </w:tc>
-        <w:tc>
-          <w:tcPr>
-            <w:tcW w:type="dxa" w:w="3009"/>
-          </w:tcPr>
-          <w:p>
-            <w:r>
-              <w:t>Atai</w:t>
-            </w:r>
-          </w:p>
-        </w:tc>
-        <w:tc>
-          <w:tcPr>
-            <w:tcW w:type="dxa" w:w="3009"/>
-          </w:tcPr>
-          <w:p>
-            <w:r>
-              <w:t>2</w:t>
+              <w:t>FR-2</w:t>
+            </w:r>
+          </w:p>
+        </w:tc>
+        <w:tc>
+          <w:tcPr>
+            <w:tcW w:type="dxa" w:w="3009"/>
+          </w:tcPr>
+          <w:p>
+            <w:r>
+              <w:t>As an admin I have role-based access so permissions are enforced</w:t>
+            </w:r>
+          </w:p>
+        </w:tc>
+        <w:tc>
+          <w:tcPr>
+            <w:tcW w:type="dxa" w:w="3009"/>
+          </w:tcPr>
+          <w:p>
+            <w:r>
+              <w:t>3</w:t>
             </w:r>
           </w:p>
         </w:tc>
@@ -1788,27 +1571,27 @@
           </w:tcPr>
           <w:p>
             <w:r>
-              <w:t>[DB] DB session factory + initial migration</w:t>
-            </w:r>
-          </w:p>
-        </w:tc>
-        <w:tc>
-          <w:tcPr>
-            <w:tcW w:type="dxa" w:w="3009"/>
-          </w:tcPr>
-          <w:p>
-            <w:r>
-              <w:t>Atai</w:t>
-            </w:r>
-          </w:p>
-        </w:tc>
-        <w:tc>
-          <w:tcPr>
-            <w:tcW w:type="dxa" w:w="3009"/>
-          </w:tcPr>
-          <w:p>
-            <w:r>
-              <w:t>1</w:t>
+              <w:t>FR-3</w:t>
+            </w:r>
+          </w:p>
+        </w:tc>
+        <w:tc>
+          <w:tcPr>
+            <w:tcW w:type="dxa" w:w="3009"/>
+          </w:tcPr>
+          <w:p>
+            <w:r>
+              <w:t>As staff I create/read/update/delete rooms and set up inventory</w:t>
+            </w:r>
+          </w:p>
+        </w:tc>
+        <w:tc>
+          <w:tcPr>
+            <w:tcW w:type="dxa" w:w="3009"/>
+          </w:tcPr>
+          <w:p>
+            <w:r>
+              <w:t>5</w:t>
             </w:r>
           </w:p>
         </w:tc>
@@ -1820,27 +1603,27 @@
           </w:tcPr>
           <w:p>
             <w:r>
-              <w:t>[BE] OTP request/verify, HMAC signing, expiry</w:t>
-            </w:r>
-          </w:p>
-        </w:tc>
-        <w:tc>
-          <w:tcPr>
-            <w:tcW w:type="dxa" w:w="3009"/>
-          </w:tcPr>
-          <w:p>
-            <w:r>
-              <w:t>Dair</w:t>
-            </w:r>
-          </w:p>
-        </w:tc>
-        <w:tc>
-          <w:tcPr>
-            <w:tcW w:type="dxa" w:w="3009"/>
-          </w:tcPr>
-          <w:p>
-            <w:r>
-              <w:t>3</w:t>
+              <w:t>FR-4</w:t>
+            </w:r>
+          </w:p>
+        </w:tc>
+        <w:tc>
+          <w:tcPr>
+            <w:tcW w:type="dxa" w:w="3009"/>
+          </w:tcPr>
+          <w:p>
+            <w:r>
+              <w:t>As a guest I check availability and hold a room before paying</w:t>
+            </w:r>
+          </w:p>
+        </w:tc>
+        <w:tc>
+          <w:tcPr>
+            <w:tcW w:type="dxa" w:w="3009"/>
+          </w:tcPr>
+          <w:p>
+            <w:r>
+              <w:t>8</w:t>
             </w:r>
           </w:p>
         </w:tc>
@@ -1852,27 +1635,27 @@
           </w:tcPr>
           <w:p>
             <w:r>
-              <w:t>[BE] JWT issue + get_current_user dependency</w:t>
-            </w:r>
-          </w:p>
-        </w:tc>
-        <w:tc>
-          <w:tcPr>
-            <w:tcW w:type="dxa" w:w="3009"/>
-          </w:tcPr>
-          <w:p>
-            <w:r>
-              <w:t>Dair</w:t>
-            </w:r>
-          </w:p>
-        </w:tc>
-        <w:tc>
-          <w:tcPr>
-            <w:tcW w:type="dxa" w:w="3009"/>
-          </w:tcPr>
-          <w:p>
-            <w:r>
-              <w:t>2</w:t>
+              <w:t>FR-5</w:t>
+            </w:r>
+          </w:p>
+        </w:tc>
+        <w:tc>
+          <w:tcPr>
+            <w:tcW w:type="dxa" w:w="3009"/>
+          </w:tcPr>
+          <w:p>
+            <w:r>
+              <w:t>As a guest I pay via Stripe so my booking is confirmed</w:t>
+            </w:r>
+          </w:p>
+        </w:tc>
+        <w:tc>
+          <w:tcPr>
+            <w:tcW w:type="dxa" w:w="3009"/>
+          </w:tcPr>
+          <w:p>
+            <w:r>
+              <w:t>8</w:t>
             </w:r>
           </w:p>
         </w:tc>
@@ -1884,27 +1667,27 @@
           </w:tcPr>
           <w:p>
             <w:r>
-              <w:t>[BE] Role-based permission guards</w:t>
-            </w:r>
-          </w:p>
-        </w:tc>
-        <w:tc>
-          <w:tcPr>
-            <w:tcW w:type="dxa" w:w="3009"/>
-          </w:tcPr>
-          <w:p>
-            <w:r>
-              <w:t>Dair</w:t>
-            </w:r>
-          </w:p>
-        </w:tc>
-        <w:tc>
-          <w:tcPr>
-            <w:tcW w:type="dxa" w:w="3009"/>
-          </w:tcPr>
-          <w:p>
-            <w:r>
-              <w:t>1</w:t>
+              <w:t>FR-6</w:t>
+            </w:r>
+          </w:p>
+        </w:tc>
+        <w:tc>
+          <w:tcPr>
+            <w:tcW w:type="dxa" w:w="3009"/>
+          </w:tcPr>
+          <w:p>
+            <w:r>
+              <w:t>As an owner I train a per-hotel model and publish dynamic prices</w:t>
+            </w:r>
+          </w:p>
+        </w:tc>
+        <w:tc>
+          <w:tcPr>
+            <w:tcW w:type="dxa" w:w="3009"/>
+          </w:tcPr>
+          <w:p>
+            <w:r>
+              <w:t>13</w:t>
             </w:r>
           </w:p>
         </w:tc>
@@ -1916,27 +1699,27 @@
           </w:tcPr>
           <w:p>
             <w:r>
-              <w:t>[FE] Login page + OTP form</w:t>
-            </w:r>
-          </w:p>
-        </w:tc>
-        <w:tc>
-          <w:tcPr>
-            <w:tcW w:type="dxa" w:w="3009"/>
-          </w:tcPr>
-          <w:p>
-            <w:r>
-              <w:t>Turat</w:t>
-            </w:r>
-          </w:p>
-        </w:tc>
-        <w:tc>
-          <w:tcPr>
-            <w:tcW w:type="dxa" w:w="3009"/>
-          </w:tcPr>
-          <w:p>
-            <w:r>
-              <w:t>2</w:t>
+              <w:t>FR-7</w:t>
+            </w:r>
+          </w:p>
+        </w:tc>
+        <w:tc>
+          <w:tcPr>
+            <w:tcW w:type="dxa" w:w="3009"/>
+          </w:tcPr>
+          <w:p>
+            <w:r>
+              <w:t>As a manager I schedule shifts and auto-assign housekeeping tasks</w:t>
+            </w:r>
+          </w:p>
+        </w:tc>
+        <w:tc>
+          <w:tcPr>
+            <w:tcW w:type="dxa" w:w="3009"/>
+          </w:tcPr>
+          <w:p>
+            <w:r>
+              <w:t>8</w:t>
             </w:r>
           </w:p>
         </w:tc>
@@ -1948,27 +1731,27 @@
           </w:tcPr>
           <w:p>
             <w:r>
-              <w:t>[FE] authStore (Zustand) + token persistence</w:t>
-            </w:r>
-          </w:p>
-        </w:tc>
-        <w:tc>
-          <w:tcPr>
-            <w:tcW w:type="dxa" w:w="3009"/>
-          </w:tcPr>
-          <w:p>
-            <w:r>
-              <w:t>Turat</w:t>
-            </w:r>
-          </w:p>
-        </w:tc>
-        <w:tc>
-          <w:tcPr>
-            <w:tcW w:type="dxa" w:w="3009"/>
-          </w:tcPr>
-          <w:p>
-            <w:r>
-              <w:t>1</w:t>
+              <w:t>FR-8</w:t>
+            </w:r>
+          </w:p>
+        </w:tc>
+        <w:tc>
+          <w:tcPr>
+            <w:tcW w:type="dxa" w:w="3009"/>
+          </w:tcPr>
+          <w:p>
+            <w:r>
+              <w:t>As an admin I see a dashboard with KPIs and quick links</w:t>
+            </w:r>
+          </w:p>
+        </w:tc>
+        <w:tc>
+          <w:tcPr>
+            <w:tcW w:type="dxa" w:w="3009"/>
+          </w:tcPr>
+          <w:p>
+            <w:r>
+              <w:t>5</w:t>
             </w:r>
           </w:p>
         </w:tc>
@@ -1980,27 +1763,187 @@
           </w:tcPr>
           <w:p>
             <w:r>
-              <w:t>[FE] ProtectedRoute + role redirect</w:t>
-            </w:r>
-          </w:p>
-        </w:tc>
-        <w:tc>
-          <w:tcPr>
-            <w:tcW w:type="dxa" w:w="3009"/>
-          </w:tcPr>
-          <w:p>
-            <w:r>
-              <w:t>Turat</w:t>
-            </w:r>
-          </w:p>
-        </w:tc>
-        <w:tc>
-          <w:tcPr>
-            <w:tcW w:type="dxa" w:w="3009"/>
-          </w:tcPr>
-          <w:p>
-            <w:r>
-              <w:t>2</w:t>
+              <w:t>FR-9</w:t>
+            </w:r>
+          </w:p>
+        </w:tc>
+        <w:tc>
+          <w:tcPr>
+            <w:tcW w:type="dxa" w:w="3009"/>
+          </w:tcPr>
+          <w:p>
+            <w:r>
+              <w:t>As a guest I access my stay details by token without logging in</w:t>
+            </w:r>
+          </w:p>
+        </w:tc>
+        <w:tc>
+          <w:tcPr>
+            <w:tcW w:type="dxa" w:w="3009"/>
+          </w:tcPr>
+          <w:p>
+            <w:r>
+              <w:t>5</w:t>
+            </w:r>
+          </w:p>
+        </w:tc>
+      </w:tr>
+      <w:tr>
+        <w:tc>
+          <w:tcPr>
+            <w:tcW w:type="dxa" w:w="3009"/>
+          </w:tcPr>
+          <w:p>
+            <w:r>
+              <w:t>FR-10</w:t>
+            </w:r>
+          </w:p>
+        </w:tc>
+        <w:tc>
+          <w:tcPr>
+            <w:tcW w:type="dxa" w:w="3009"/>
+          </w:tcPr>
+          <w:p>
+            <w:r>
+              <w:t>As a guest I complete booking with success/cancel pages</w:t>
+            </w:r>
+          </w:p>
+        </w:tc>
+        <w:tc>
+          <w:tcPr>
+            <w:tcW w:type="dxa" w:w="3009"/>
+          </w:tcPr>
+          <w:p>
+            <w:r>
+              <w:t>3</w:t>
+            </w:r>
+          </w:p>
+        </w:tc>
+      </w:tr>
+      <w:tr>
+        <w:tc>
+          <w:tcPr>
+            <w:tcW w:type="dxa" w:w="3009"/>
+          </w:tcPr>
+          <w:p>
+            <w:r>
+              <w:t>FR-11</w:t>
+            </w:r>
+          </w:p>
+        </w:tc>
+        <w:tc>
+          <w:tcPr>
+            <w:tcW w:type="dxa" w:w="3009"/>
+          </w:tcPr>
+          <w:p>
+            <w:r>
+              <w:t>As staff I start my shift and see my assigned tasks</w:t>
+            </w:r>
+          </w:p>
+        </w:tc>
+        <w:tc>
+          <w:tcPr>
+            <w:tcW w:type="dxa" w:w="3009"/>
+          </w:tcPr>
+          <w:p>
+            <w:r>
+              <w:t>5</w:t>
+            </w:r>
+          </w:p>
+        </w:tc>
+      </w:tr>
+      <w:tr>
+        <w:tc>
+          <w:tcPr>
+            <w:tcW w:type="dxa" w:w="3009"/>
+          </w:tcPr>
+          <w:p>
+            <w:r>
+              <w:t>FR-12</w:t>
+            </w:r>
+          </w:p>
+        </w:tc>
+        <w:tc>
+          <w:tcPr>
+            <w:tcW w:type="dxa" w:w="3009"/>
+          </w:tcPr>
+          <w:p>
+            <w:r>
+              <w:t>As a manager I view bookings/revenue reports</w:t>
+            </w:r>
+          </w:p>
+        </w:tc>
+        <w:tc>
+          <w:tcPr>
+            <w:tcW w:type="dxa" w:w="3009"/>
+          </w:tcPr>
+          <w:p>
+            <w:r>
+              <w:t>5</w:t>
+            </w:r>
+          </w:p>
+        </w:tc>
+      </w:tr>
+      <w:tr>
+        <w:tc>
+          <w:tcPr>
+            <w:tcW w:type="dxa" w:w="3009"/>
+          </w:tcPr>
+          <w:p>
+            <w:r>
+              <w:t>FR-13</w:t>
+            </w:r>
+          </w:p>
+        </w:tc>
+        <w:tc>
+          <w:tcPr>
+            <w:tcW w:type="dxa" w:w="3009"/>
+          </w:tcPr>
+          <w:p>
+            <w:r>
+              <w:t>As an external hotel site I sync bookings two-way with the PMS (HMAC)</w:t>
+            </w:r>
+          </w:p>
+        </w:tc>
+        <w:tc>
+          <w:tcPr>
+            <w:tcW w:type="dxa" w:w="3009"/>
+          </w:tcPr>
+          <w:p>
+            <w:r>
+              <w:t>13</w:t>
+            </w:r>
+          </w:p>
+        </w:tc>
+      </w:tr>
+      <w:tr>
+        <w:tc>
+          <w:tcPr>
+            <w:tcW w:type="dxa" w:w="3009"/>
+          </w:tcPr>
+          <w:p>
+            <w:r>
+              <w:t>FR-14</w:t>
+            </w:r>
+          </w:p>
+        </w:tc>
+        <w:tc>
+          <w:tcPr>
+            <w:tcW w:type="dxa" w:w="3009"/>
+          </w:tcPr>
+          <w:p>
+            <w:r>
+              <w:t>As a manager I view occupancy/RevPAR/loyalty dashboards</w:t>
+            </w:r>
+          </w:p>
+        </w:tc>
+        <w:tc>
+          <w:tcPr>
+            <w:tcW w:type="dxa" w:w="3009"/>
+          </w:tcPr>
+          <w:p>
+            <w:r>
+              <w:t>8</w:t>
             </w:r>
           </w:p>
         </w:tc>
@@ -2009,15 +1952,32 @@
     <w:p/>
     <w:p>
       <w:pPr>
+        <w:pStyle w:val="1"/>
+      </w:pPr>
+      <w:r>
+        <w:t>5. Sprint Development &amp; Results</w:t>
+      </w:r>
+    </w:p>
+    <w:p>
+      <w:pPr>
         <w:pStyle w:val="2"/>
       </w:pPr>
       <w:r>
-        <w:t>Sprint 2 — Rooms, Inventory &amp; Booking Core</w:t>
-      </w:r>
-    </w:p>
-    <w:p>
-      <w:r>
-        <w:t>Sprint goal: a guest can browse rooms, hold one, and complete a booking.</w:t>
+        <w:t>Sprint 1 — Auth &amp; User Foundation</w:t>
+      </w:r>
+    </w:p>
+    <w:p>
+      <w:r>
+        <w:t>Sprint goal: any user can log in via email OTP and receive a JWT that gates all subsequent pages.</w:t>
+      </w:r>
+    </w:p>
+    <w:p>
+      <w:r>
+        <w:rPr>
+          <w:i/>
+          <w:sz w:val="18"/>
+        </w:rPr>
+        <w:t>Table 5 — Sprint 1 task breakdown.</w:t>
       </w:r>
     </w:p>
     <w:tbl>
@@ -2090,7 +2050,7 @@
           </w:tcPr>
           <w:p>
             <w:r>
-              <w:t>[DB] rooms, bookings, guest_tokens models</w:t>
+              <w:t>[DB] users, auth_sessions, email_otp tables</w:t>
             </w:r>
           </w:p>
         </w:tc>
@@ -2122,7 +2082,7 @@
           </w:tcPr>
           <w:p>
             <w:r>
-              <w:t>[DB] FK constraints + indexes on room_id, check_in/out</w:t>
+              <w:t>[DB] SQLAlchemy models: User, AuthSession, EmailOtp</w:t>
             </w:r>
           </w:p>
         </w:tc>
@@ -2142,7 +2102,7 @@
           </w:tcPr>
           <w:p>
             <w:r>
-              <w:t>1</w:t>
+              <w:t>2</w:t>
             </w:r>
           </w:p>
         </w:tc>
@@ -2154,27 +2114,27 @@
           </w:tcPr>
           <w:p>
             <w:r>
-              <w:t>[BE] Room CRUD endpoints</w:t>
-            </w:r>
-          </w:p>
-        </w:tc>
-        <w:tc>
-          <w:tcPr>
-            <w:tcW w:type="dxa" w:w="3009"/>
-          </w:tcPr>
-          <w:p>
-            <w:r>
-              <w:t>Dair</w:t>
-            </w:r>
-          </w:p>
-        </w:tc>
-        <w:tc>
-          <w:tcPr>
-            <w:tcW w:type="dxa" w:w="3009"/>
-          </w:tcPr>
-          <w:p>
-            <w:r>
-              <w:t>2</w:t>
+              <w:t>[DB] DB session factory + initial migration</w:t>
+            </w:r>
+          </w:p>
+        </w:tc>
+        <w:tc>
+          <w:tcPr>
+            <w:tcW w:type="dxa" w:w="3009"/>
+          </w:tcPr>
+          <w:p>
+            <w:r>
+              <w:t>Atai</w:t>
+            </w:r>
+          </w:p>
+        </w:tc>
+        <w:tc>
+          <w:tcPr>
+            <w:tcW w:type="dxa" w:w="3009"/>
+          </w:tcPr>
+          <w:p>
+            <w:r>
+              <w:t>1</w:t>
             </w:r>
           </w:p>
         </w:tc>
@@ -2186,7 +2146,7 @@
           </w:tcPr>
           <w:p>
             <w:r>
-              <w:t>[BE] Inventory setup + availability logic</w:t>
+              <w:t>[BE] OTP request/verify, HMAC signing, expiry</w:t>
             </w:r>
           </w:p>
         </w:tc>
@@ -2206,7 +2166,7 @@
           </w:tcPr>
           <w:p>
             <w:r>
-              <w:t>2</w:t>
+              <w:t>3</w:t>
             </w:r>
           </w:p>
         </w:tc>
@@ -2218,7 +2178,7 @@
           </w:tcPr>
           <w:p>
             <w:r>
-              <w:t>[BE] Booking create/confirm/cancel + hold system</w:t>
+              <w:t>[BE] JWT issue + get_current_user dependency</w:t>
             </w:r>
           </w:p>
         </w:tc>
@@ -2238,7 +2198,7 @@
           </w:tcPr>
           <w:p>
             <w:r>
-              <w:t>3</w:t>
+              <w:t>2</w:t>
             </w:r>
           </w:p>
         </w:tc>
@@ -2250,7 +2210,39 @@
           </w:tcPr>
           <w:p>
             <w:r>
-              <w:t>[FE] BookingPage / Success / Cancel, RoomCard</w:t>
+              <w:t>[BE] Role-based permission guards</w:t>
+            </w:r>
+          </w:p>
+        </w:tc>
+        <w:tc>
+          <w:tcPr>
+            <w:tcW w:type="dxa" w:w="3009"/>
+          </w:tcPr>
+          <w:p>
+            <w:r>
+              <w:t>Dair</w:t>
+            </w:r>
+          </w:p>
+        </w:tc>
+        <w:tc>
+          <w:tcPr>
+            <w:tcW w:type="dxa" w:w="3009"/>
+          </w:tcPr>
+          <w:p>
+            <w:r>
+              <w:t>1</w:t>
+            </w:r>
+          </w:p>
+        </w:tc>
+      </w:tr>
+      <w:tr>
+        <w:tc>
+          <w:tcPr>
+            <w:tcW w:type="dxa" w:w="3009"/>
+          </w:tcPr>
+          <w:p>
+            <w:r>
+              <w:t>[FE] Login page + OTP form</w:t>
             </w:r>
           </w:p>
         </w:tc>
@@ -2270,7 +2262,71 @@
           </w:tcPr>
           <w:p>
             <w:r>
-              <w:t>6</w:t>
+              <w:t>2</w:t>
+            </w:r>
+          </w:p>
+        </w:tc>
+      </w:tr>
+      <w:tr>
+        <w:tc>
+          <w:tcPr>
+            <w:tcW w:type="dxa" w:w="3009"/>
+          </w:tcPr>
+          <w:p>
+            <w:r>
+              <w:t>[FE] authStore (Zustand) + token persistence</w:t>
+            </w:r>
+          </w:p>
+        </w:tc>
+        <w:tc>
+          <w:tcPr>
+            <w:tcW w:type="dxa" w:w="3009"/>
+          </w:tcPr>
+          <w:p>
+            <w:r>
+              <w:t>Turat</w:t>
+            </w:r>
+          </w:p>
+        </w:tc>
+        <w:tc>
+          <w:tcPr>
+            <w:tcW w:type="dxa" w:w="3009"/>
+          </w:tcPr>
+          <w:p>
+            <w:r>
+              <w:t>1</w:t>
+            </w:r>
+          </w:p>
+        </w:tc>
+      </w:tr>
+      <w:tr>
+        <w:tc>
+          <w:tcPr>
+            <w:tcW w:type="dxa" w:w="3009"/>
+          </w:tcPr>
+          <w:p>
+            <w:r>
+              <w:t>[FE] ProtectedRoute + role redirect</w:t>
+            </w:r>
+          </w:p>
+        </w:tc>
+        <w:tc>
+          <w:tcPr>
+            <w:tcW w:type="dxa" w:w="3009"/>
+          </w:tcPr>
+          <w:p>
+            <w:r>
+              <w:t>Turat</w:t>
+            </w:r>
+          </w:p>
+        </w:tc>
+        <w:tc>
+          <w:tcPr>
+            <w:tcW w:type="dxa" w:w="3009"/>
+          </w:tcPr>
+          <w:p>
+            <w:r>
+              <w:t>2</w:t>
             </w:r>
           </w:p>
         </w:tc>
@@ -2282,12 +2338,21 @@
         <w:pStyle w:val="2"/>
       </w:pPr>
       <w:r>
-        <w:t>Sprint 3 — Pricing Engine (ML)</w:t>
-      </w:r>
-    </w:p>
-    <w:p>
-      <w:r>
-        <w:t>Sprint goal: admin can train a per-hotel model, publish dynamic prices, and view them in the Pricing Lab.</w:t>
+        <w:t>Sprint 2 — Rooms, Inventory &amp; Booking Core</w:t>
+      </w:r>
+    </w:p>
+    <w:p>
+      <w:r>
+        <w:t>Sprint goal: a guest can browse rooms, hold one, and complete a booking.</w:t>
+      </w:r>
+    </w:p>
+    <w:p>
+      <w:r>
+        <w:rPr>
+          <w:i/>
+          <w:sz w:val="18"/>
+        </w:rPr>
+        <w:t>Table 6 — Sprint 2 task breakdown.</w:t>
       </w:r>
     </w:p>
     <w:tbl>
@@ -2360,7 +2425,7 @@
           </w:tcPr>
           <w:p>
             <w:r>
-              <w:t>[DB] Pricing tables (config, model registry, jobs)</w:t>
+              <w:t>[DB] rooms, bookings, guest_tokens models</w:t>
             </w:r>
           </w:p>
         </w:tc>
@@ -2380,7 +2445,7 @@
           </w:tcPr>
           <w:p>
             <w:r>
-              <w:t>3</w:t>
+              <w:t>2</w:t>
             </w:r>
           </w:p>
         </w:tc>
@@ -2392,7 +2457,7 @@
           </w:tcPr>
           <w:p>
             <w:r>
-              <w:t>[DB] Synthetic data generation script</w:t>
+              <w:t>[DB] FK constraints + indexes on room_id, check_in/out</w:t>
             </w:r>
           </w:p>
         </w:tc>
@@ -2412,7 +2477,7 @@
           </w:tcPr>
           <w:p>
             <w:r>
-              <w:t>2</w:t>
+              <w:t>1</w:t>
             </w:r>
           </w:p>
         </w:tc>
@@ -2424,7 +2489,7 @@
           </w:tcPr>
           <w:p>
             <w:r>
-              <w:t>[BE] Feature engineering + training pipeline</w:t>
+              <w:t>[BE] Room CRUD endpoints</w:t>
             </w:r>
           </w:p>
         </w:tc>
@@ -2444,7 +2509,7 @@
           </w:tcPr>
           <w:p>
             <w:r>
-              <w:t>3</w:t>
+              <w:t>2</w:t>
             </w:r>
           </w:p>
         </w:tc>
@@ -2456,7 +2521,7 @@
           </w:tcPr>
           <w:p>
             <w:r>
-              <w:t>[BE] Optimizer + rules engine + Pricing Lab API</w:t>
+              <w:t>[BE] Inventory setup + availability logic</w:t>
             </w:r>
           </w:p>
         </w:tc>
@@ -2476,7 +2541,7 @@
           </w:tcPr>
           <w:p>
             <w:r>
-              <w:t>4</w:t>
+              <w:t>2</w:t>
             </w:r>
           </w:p>
         </w:tc>
@@ -2488,7 +2553,39 @@
           </w:tcPr>
           <w:p>
             <w:r>
-              <w:t>[FE] PricingLab / ModelTraining / EngineHub pages</w:t>
+              <w:t>[BE] Booking create/confirm/cancel + hold system</w:t>
+            </w:r>
+          </w:p>
+        </w:tc>
+        <w:tc>
+          <w:tcPr>
+            <w:tcW w:type="dxa" w:w="3009"/>
+          </w:tcPr>
+          <w:p>
+            <w:r>
+              <w:t>Dair</w:t>
+            </w:r>
+          </w:p>
+        </w:tc>
+        <w:tc>
+          <w:tcPr>
+            <w:tcW w:type="dxa" w:w="3009"/>
+          </w:tcPr>
+          <w:p>
+            <w:r>
+              <w:t>3</w:t>
+            </w:r>
+          </w:p>
+        </w:tc>
+      </w:tr>
+      <w:tr>
+        <w:tc>
+          <w:tcPr>
+            <w:tcW w:type="dxa" w:w="3009"/>
+          </w:tcPr>
+          <w:p>
+            <w:r>
+              <w:t>[FE] BookingPage / Success / Cancel, RoomCard</w:t>
             </w:r>
           </w:p>
         </w:tc>
@@ -2520,12 +2617,21 @@
         <w:pStyle w:val="2"/>
       </w:pPr>
       <w:r>
-        <w:t>Sprint 4 — Staff, Shifts &amp; Task Management</w:t>
-      </w:r>
-    </w:p>
-    <w:p>
-      <w:r>
-        <w:t>Sprint goal: managers schedule shifts, tasks auto-assign round-robin, staff start their shifts.</w:t>
+        <w:t>Sprint 3 — Pricing Engine (ML)</w:t>
+      </w:r>
+    </w:p>
+    <w:p>
+      <w:r>
+        <w:t>Sprint goal: admin can train a per-hotel model, publish dynamic prices, and view them in the Pricing Lab.</w:t>
+      </w:r>
+    </w:p>
+    <w:p>
+      <w:r>
+        <w:rPr>
+          <w:i/>
+          <w:sz w:val="18"/>
+        </w:rPr>
+        <w:t>Table 7 — Sprint 3 task breakdown.</w:t>
       </w:r>
     </w:p>
     <w:tbl>
@@ -2598,7 +2704,7 @@
           </w:tcPr>
           <w:p>
             <w:r>
-              <w:t>[DB] tasks table + staff fields; shift session model</w:t>
+              <w:t>[DB] Pricing tables (config, model registry, jobs)</w:t>
             </w:r>
           </w:p>
         </w:tc>
@@ -2630,27 +2736,27 @@
           </w:tcPr>
           <w:p>
             <w:r>
-              <w:t>[BE] Staff CRUD + shift start/end + round-robin tasks</w:t>
-            </w:r>
-          </w:p>
-        </w:tc>
-        <w:tc>
-          <w:tcPr>
-            <w:tcW w:type="dxa" w:w="3009"/>
-          </w:tcPr>
-          <w:p>
-            <w:r>
-              <w:t>Dair</w:t>
-            </w:r>
-          </w:p>
-        </w:tc>
-        <w:tc>
-          <w:tcPr>
-            <w:tcW w:type="dxa" w:w="3009"/>
-          </w:tcPr>
-          <w:p>
-            <w:r>
-              <w:t>5</w:t>
+              <w:t>[DB] Synthetic data generation script</w:t>
+            </w:r>
+          </w:p>
+        </w:tc>
+        <w:tc>
+          <w:tcPr>
+            <w:tcW w:type="dxa" w:w="3009"/>
+          </w:tcPr>
+          <w:p>
+            <w:r>
+              <w:t>Atai</w:t>
+            </w:r>
+          </w:p>
+        </w:tc>
+        <w:tc>
+          <w:tcPr>
+            <w:tcW w:type="dxa" w:w="3009"/>
+          </w:tcPr>
+          <w:p>
+            <w:r>
+              <w:t>2</w:t>
             </w:r>
           </w:p>
         </w:tc>
@@ -2662,7 +2768,71 @@
           </w:tcPr>
           <w:p>
             <w:r>
-              <w:t>[FE] StaffPlanner / Staff / ShiftStart / TaskCard</w:t>
+              <w:t>[BE] Feature engineering + training pipeline</w:t>
+            </w:r>
+          </w:p>
+        </w:tc>
+        <w:tc>
+          <w:tcPr>
+            <w:tcW w:type="dxa" w:w="3009"/>
+          </w:tcPr>
+          <w:p>
+            <w:r>
+              <w:t>Dair</w:t>
+            </w:r>
+          </w:p>
+        </w:tc>
+        <w:tc>
+          <w:tcPr>
+            <w:tcW w:type="dxa" w:w="3009"/>
+          </w:tcPr>
+          <w:p>
+            <w:r>
+              <w:t>3</w:t>
+            </w:r>
+          </w:p>
+        </w:tc>
+      </w:tr>
+      <w:tr>
+        <w:tc>
+          <w:tcPr>
+            <w:tcW w:type="dxa" w:w="3009"/>
+          </w:tcPr>
+          <w:p>
+            <w:r>
+              <w:t>[BE] Optimizer + rules engine + Pricing Lab API</w:t>
+            </w:r>
+          </w:p>
+        </w:tc>
+        <w:tc>
+          <w:tcPr>
+            <w:tcW w:type="dxa" w:w="3009"/>
+          </w:tcPr>
+          <w:p>
+            <w:r>
+              <w:t>Dair</w:t>
+            </w:r>
+          </w:p>
+        </w:tc>
+        <w:tc>
+          <w:tcPr>
+            <w:tcW w:type="dxa" w:w="3009"/>
+          </w:tcPr>
+          <w:p>
+            <w:r>
+              <w:t>4</w:t>
+            </w:r>
+          </w:p>
+        </w:tc>
+      </w:tr>
+      <w:tr>
+        <w:tc>
+          <w:tcPr>
+            <w:tcW w:type="dxa" w:w="3009"/>
+          </w:tcPr>
+          <w:p>
+            <w:r>
+              <w:t>[FE] PricingLab / ModelTraining / EngineHub pages</w:t>
             </w:r>
           </w:p>
         </w:tc>
@@ -2694,12 +2864,21 @@
         <w:pStyle w:val="2"/>
       </w:pPr>
       <w:r>
-        <w:t>Sprint 5 — Payments, Guest Portal &amp; Polish</w:t>
-      </w:r>
-    </w:p>
-    <w:p>
-      <w:r>
-        <w:t>Sprint goal: end-to-end paid booking; guest receives email; token portal; admin reports.</w:t>
+        <w:t>Sprint 4 — Staff, Shifts &amp; Task Management</w:t>
+      </w:r>
+    </w:p>
+    <w:p>
+      <w:r>
+        <w:t>Sprint goal: managers schedule shifts, tasks auto-assign round-robin, staff start their shifts.</w:t>
+      </w:r>
+    </w:p>
+    <w:p>
+      <w:r>
+        <w:rPr>
+          <w:i/>
+          <w:sz w:val="18"/>
+        </w:rPr>
+        <w:t>Table 8 — Sprint 4 task breakdown.</w:t>
       </w:r>
     </w:p>
     <w:tbl>
@@ -2772,7 +2951,7 @@
           </w:tcPr>
           <w:p>
             <w:r>
-              <w:t>[DB] Stripe fields on bookings; OTP seeding/cleanup</w:t>
+              <w:t>[DB] tasks table + staff fields; shift session model</w:t>
             </w:r>
           </w:p>
         </w:tc>
@@ -2792,7 +2971,7 @@
           </w:tcPr>
           <w:p>
             <w:r>
-              <w:t>2</w:t>
+              <w:t>3</w:t>
             </w:r>
           </w:p>
         </w:tc>
@@ -2804,7 +2983,7 @@
           </w:tcPr>
           <w:p>
             <w:r>
-              <w:t>[BE] Stripe checkout + webhook; email service; /guest</w:t>
+              <w:t>[BE] Staff CRUD + shift start/end + round-robin tasks</w:t>
             </w:r>
           </w:p>
         </w:tc>
@@ -2836,7 +3015,7 @@
           </w:tcPr>
           <w:p>
             <w:r>
-              <w:t>[FE] GuestPage / AdminPage / ReportsPage / Settings</w:t>
+              <w:t>[FE] StaffPlanner / Staff / ShiftStart / TaskCard</w:t>
             </w:r>
           </w:p>
         </w:tc>
@@ -2856,7 +3035,7 @@
           </w:tcPr>
           <w:p>
             <w:r>
-              <w:t>8</w:t>
+              <w:t>6</w:t>
             </w:r>
           </w:p>
         </w:tc>
@@ -2868,6 +3047,189 @@
         <w:pStyle w:val="2"/>
       </w:pPr>
       <w:r>
+        <w:t>Sprint 5 — Payments, Guest Portal &amp; Polish</w:t>
+      </w:r>
+    </w:p>
+    <w:p>
+      <w:r>
+        <w:t>Sprint goal: end-to-end paid booking; guest receives email; token portal; admin reports.</w:t>
+      </w:r>
+    </w:p>
+    <w:p>
+      <w:r>
+        <w:rPr>
+          <w:i/>
+          <w:sz w:val="18"/>
+        </w:rPr>
+        <w:t>Table 9 — Sprint 5 task breakdown.</w:t>
+      </w:r>
+    </w:p>
+    <w:tbl>
+      <w:tblPr>
+        <w:tblW w:type="auto" w:w="0"/>
+        <w:jc w:val="center"/>
+        <w:tblLook w:firstColumn="1" w:firstRow="1" w:lastColumn="0" w:lastRow="0" w:noHBand="0" w:noVBand="1" w:val="04A0"/>
+        <w:tblBorders>
+          <w:top w:val="single" w:sz="4" w:color="999999"/>
+          <w:left w:val="single" w:sz="4" w:color="999999"/>
+          <w:bottom w:val="single" w:sz="4" w:color="999999"/>
+          <w:right w:val="single" w:sz="4" w:color="999999"/>
+          <w:insideH w:val="single" w:sz="4" w:color="999999"/>
+          <w:insideV w:val="single" w:sz="4" w:color="999999"/>
+        </w:tblBorders>
+      </w:tblPr>
+      <w:tblGrid>
+        <w:gridCol w:w="3009"/>
+        <w:gridCol w:w="3009"/>
+        <w:gridCol w:w="3009"/>
+      </w:tblGrid>
+      <w:tr>
+        <w:tc>
+          <w:tcPr>
+            <w:tcW w:type="dxa" w:w="3009"/>
+          </w:tcPr>
+          <w:p>
+            <w:r/>
+            <w:r>
+              <w:rPr>
+                <w:b/>
+              </w:rPr>
+              <w:t>Task</w:t>
+            </w:r>
+          </w:p>
+        </w:tc>
+        <w:tc>
+          <w:tcPr>
+            <w:tcW w:type="dxa" w:w="3009"/>
+          </w:tcPr>
+          <w:p>
+            <w:r/>
+            <w:r>
+              <w:rPr>
+                <w:b/>
+              </w:rPr>
+              <w:t>Owner</w:t>
+            </w:r>
+          </w:p>
+        </w:tc>
+        <w:tc>
+          <w:tcPr>
+            <w:tcW w:type="dxa" w:w="3009"/>
+          </w:tcPr>
+          <w:p>
+            <w:r/>
+            <w:r>
+              <w:rPr>
+                <w:b/>
+              </w:rPr>
+              <w:t>Days</w:t>
+            </w:r>
+          </w:p>
+        </w:tc>
+      </w:tr>
+      <w:tr>
+        <w:tc>
+          <w:tcPr>
+            <w:tcW w:type="dxa" w:w="3009"/>
+          </w:tcPr>
+          <w:p>
+            <w:r>
+              <w:t>[DB] Stripe fields on bookings; OTP seeding/cleanup</w:t>
+            </w:r>
+          </w:p>
+        </w:tc>
+        <w:tc>
+          <w:tcPr>
+            <w:tcW w:type="dxa" w:w="3009"/>
+          </w:tcPr>
+          <w:p>
+            <w:r>
+              <w:t>Atai</w:t>
+            </w:r>
+          </w:p>
+        </w:tc>
+        <w:tc>
+          <w:tcPr>
+            <w:tcW w:type="dxa" w:w="3009"/>
+          </w:tcPr>
+          <w:p>
+            <w:r>
+              <w:t>2</w:t>
+            </w:r>
+          </w:p>
+        </w:tc>
+      </w:tr>
+      <w:tr>
+        <w:tc>
+          <w:tcPr>
+            <w:tcW w:type="dxa" w:w="3009"/>
+          </w:tcPr>
+          <w:p>
+            <w:r>
+              <w:t>[BE] Stripe checkout + webhook; email service; /guest</w:t>
+            </w:r>
+          </w:p>
+        </w:tc>
+        <w:tc>
+          <w:tcPr>
+            <w:tcW w:type="dxa" w:w="3009"/>
+          </w:tcPr>
+          <w:p>
+            <w:r>
+              <w:t>Dair</w:t>
+            </w:r>
+          </w:p>
+        </w:tc>
+        <w:tc>
+          <w:tcPr>
+            <w:tcW w:type="dxa" w:w="3009"/>
+          </w:tcPr>
+          <w:p>
+            <w:r>
+              <w:t>5</w:t>
+            </w:r>
+          </w:p>
+        </w:tc>
+      </w:tr>
+      <w:tr>
+        <w:tc>
+          <w:tcPr>
+            <w:tcW w:type="dxa" w:w="3009"/>
+          </w:tcPr>
+          <w:p>
+            <w:r>
+              <w:t>[FE] GuestPage / AdminPage / ReportsPage / Settings</w:t>
+            </w:r>
+          </w:p>
+        </w:tc>
+        <w:tc>
+          <w:tcPr>
+            <w:tcW w:type="dxa" w:w="3009"/>
+          </w:tcPr>
+          <w:p>
+            <w:r>
+              <w:t>Turat</w:t>
+            </w:r>
+          </w:p>
+        </w:tc>
+        <w:tc>
+          <w:tcPr>
+            <w:tcW w:type="dxa" w:w="3009"/>
+          </w:tcPr>
+          <w:p>
+            <w:r>
+              <w:t>8</w:t>
+            </w:r>
+          </w:p>
+        </w:tc>
+      </w:tr>
+    </w:tbl>
+    <w:p/>
+    <w:p>
+      <w:pPr>
+        <w:pStyle w:val="2"/>
+      </w:pPr>
+      <w:r>
         <w:t>Post-MVP — Hotel-Sync Simulator, DWH, Airflow &amp; Superset (Atai)</w:t>
       </w:r>
     </w:p>
@@ -2900,7 +3262,7 @@
         <w:drawing>
           <wp:inline xmlns:a="http://schemas.openxmlformats.org/drawingml/2006/main" xmlns:pic="http://schemas.openxmlformats.org/drawingml/2006/picture">
             <wp:extent cx="5669280" cy="2032908"/>
-            <wp:docPr id="1" name="Picture 1"/>
+            <wp:docPr id="2" name="Picture 2"/>
             <wp:cNvGraphicFramePr>
               <a:graphicFrameLocks noChangeAspect="1"/>
             </wp:cNvGraphicFramePr>
@@ -2912,7 +3274,7 @@
                     <pic:cNvPicPr/>
                   </pic:nvPicPr>
                   <pic:blipFill>
-                    <a:blip r:embed="rId13"/>
+                    <a:blip r:embed="rId14"/>
                     <a:stretch>
                       <a:fillRect/>
                     </a:stretch>
@@ -2960,7 +3322,7 @@
         <w:drawing>
           <wp:inline xmlns:a="http://schemas.openxmlformats.org/drawingml/2006/main" xmlns:pic="http://schemas.openxmlformats.org/drawingml/2006/picture">
             <wp:extent cx="5669280" cy="24395084"/>
-            <wp:docPr id="2" name="Picture 2"/>
+            <wp:docPr id="3" name="Picture 3"/>
             <wp:cNvGraphicFramePr>
               <a:graphicFrameLocks noChangeAspect="1"/>
             </wp:cNvGraphicFramePr>
@@ -2972,7 +3334,7 @@
                     <pic:cNvPicPr/>
                   </pic:nvPicPr>
                   <pic:blipFill>
-                    <a:blip r:embed="rId14"/>
+                    <a:blip r:embed="rId15"/>
                     <a:stretch>
                       <a:fillRect/>
                     </a:stretch>
@@ -3020,7 +3382,7 @@
         <w:drawing>
           <wp:inline xmlns:a="http://schemas.openxmlformats.org/drawingml/2006/main" xmlns:pic="http://schemas.openxmlformats.org/drawingml/2006/picture">
             <wp:extent cx="5669280" cy="6114870"/>
-            <wp:docPr id="3" name="Picture 3"/>
+            <wp:docPr id="4" name="Picture 4"/>
             <wp:cNvGraphicFramePr>
               <a:graphicFrameLocks noChangeAspect="1"/>
             </wp:cNvGraphicFramePr>
@@ -3032,7 +3394,7 @@
                     <pic:cNvPicPr/>
                   </pic:nvPicPr>
                   <pic:blipFill>
-                    <a:blip r:embed="rId15"/>
+                    <a:blip r:embed="rId16"/>
                     <a:stretch>
                       <a:fillRect/>
                     </a:stretch>
@@ -3080,7 +3442,7 @@
         <w:drawing>
           <wp:inline xmlns:a="http://schemas.openxmlformats.org/drawingml/2006/main" xmlns:pic="http://schemas.openxmlformats.org/drawingml/2006/picture">
             <wp:extent cx="5669280" cy="5759353"/>
-            <wp:docPr id="4" name="Picture 4"/>
+            <wp:docPr id="5" name="Picture 5"/>
             <wp:cNvGraphicFramePr>
               <a:graphicFrameLocks noChangeAspect="1"/>
             </wp:cNvGraphicFramePr>
@@ -3092,7 +3454,7 @@
                     <pic:cNvPicPr/>
                   </pic:nvPicPr>
                   <pic:blipFill>
-                    <a:blip r:embed="rId16"/>
+                    <a:blip r:embed="rId17"/>
                     <a:stretch>
                       <a:fillRect/>
                     </a:stretch>
@@ -3140,7 +3502,7 @@
         <w:drawing>
           <wp:inline xmlns:a="http://schemas.openxmlformats.org/drawingml/2006/main" xmlns:pic="http://schemas.openxmlformats.org/drawingml/2006/picture">
             <wp:extent cx="5669280" cy="2502807"/>
-            <wp:docPr id="5" name="Picture 5"/>
+            <wp:docPr id="6" name="Picture 6"/>
             <wp:cNvGraphicFramePr>
               <a:graphicFrameLocks noChangeAspect="1"/>
             </wp:cNvGraphicFramePr>
@@ -3152,7 +3514,7 @@
                     <pic:cNvPicPr/>
                   </pic:nvPicPr>
                   <pic:blipFill>
-                    <a:blip r:embed="rId17"/>
+                    <a:blip r:embed="rId18"/>
                     <a:stretch>
                       <a:fillRect/>
                     </a:stretch>
@@ -3192,7 +3554,7 @@
         <w:drawing>
           <wp:inline xmlns:a="http://schemas.openxmlformats.org/drawingml/2006/main" xmlns:pic="http://schemas.openxmlformats.org/drawingml/2006/picture">
             <wp:extent cx="5669280" cy="2248709"/>
-            <wp:docPr id="6" name="Picture 6"/>
+            <wp:docPr id="7" name="Picture 7"/>
             <wp:cNvGraphicFramePr>
               <a:graphicFrameLocks noChangeAspect="1"/>
             </wp:cNvGraphicFramePr>
@@ -3204,7 +3566,7 @@
                     <pic:cNvPicPr/>
                   </pic:nvPicPr>
                   <pic:blipFill>
-                    <a:blip r:embed="rId18"/>
+                    <a:blip r:embed="rId19"/>
                     <a:stretch>
                       <a:fillRect/>
                     </a:stretch>
@@ -3244,7 +3606,7 @@
         <w:drawing>
           <wp:inline xmlns:a="http://schemas.openxmlformats.org/drawingml/2006/main" xmlns:pic="http://schemas.openxmlformats.org/drawingml/2006/picture">
             <wp:extent cx="5669280" cy="304765"/>
-            <wp:docPr id="7" name="Picture 7"/>
+            <wp:docPr id="8" name="Picture 8"/>
             <wp:cNvGraphicFramePr>
               <a:graphicFrameLocks noChangeAspect="1"/>
             </wp:cNvGraphicFramePr>
@@ -3256,7 +3618,7 @@
                     <pic:cNvPicPr/>
                   </pic:nvPicPr>
                   <pic:blipFill>
-                    <a:blip r:embed="rId19"/>
+                    <a:blip r:embed="rId20"/>
                     <a:stretch>
                       <a:fillRect/>
                     </a:stretch>
@@ -3290,6 +3652,58 @@
     <w:p/>
     <w:p>
       <w:pPr>
+        <w:jc w:val="center"/>
+      </w:pPr>
+      <w:r>
+        <w:drawing>
+          <wp:inline xmlns:a="http://schemas.openxmlformats.org/drawingml/2006/main" xmlns:pic="http://schemas.openxmlformats.org/drawingml/2006/picture">
+            <wp:extent cx="5669280" cy="3529368"/>
+            <wp:docPr id="9" name="Picture 9"/>
+            <wp:cNvGraphicFramePr>
+              <a:graphicFrameLocks noChangeAspect="1"/>
+            </wp:cNvGraphicFramePr>
+            <a:graphic>
+              <a:graphicData uri="http://schemas.openxmlformats.org/drawingml/2006/picture">
+                <pic:pic>
+                  <pic:nvPicPr>
+                    <pic:cNvPr id="0" name="e9519a2781e70974.png"/>
+                    <pic:cNvPicPr/>
+                  </pic:nvPicPr>
+                  <pic:blipFill>
+                    <a:blip r:embed="rId21"/>
+                    <a:stretch>
+                      <a:fillRect/>
+                    </a:stretch>
+                  </pic:blipFill>
+                  <pic:spPr>
+                    <a:xfrm>
+                      <a:off x="0" y="0"/>
+                      <a:ext cx="5669280" cy="3529368"/>
+                    </a:xfrm>
+                    <a:prstGeom prst="rect"/>
+                  </pic:spPr>
+                </pic:pic>
+              </a:graphicData>
+            </a:graphic>
+          </wp:inline>
+        </w:drawing>
+      </w:r>
+    </w:p>
+    <w:p>
+      <w:pPr>
+        <w:jc w:val="center"/>
+      </w:pPr>
+      <w:r>
+        <w:rPr>
+          <w:i/>
+          <w:sz w:val="18"/>
+        </w:rPr>
+        <w:t>Figure 6.5d — Stripe payment &amp; webhook flow.</w:t>
+      </w:r>
+    </w:p>
+    <w:p/>
+    <w:p>
+      <w:pPr>
         <w:pStyle w:val="2"/>
       </w:pPr>
       <w:r>
@@ -3304,7 +3718,7 @@
         <w:drawing>
           <wp:inline xmlns:a="http://schemas.openxmlformats.org/drawingml/2006/main" xmlns:pic="http://schemas.openxmlformats.org/drawingml/2006/picture">
             <wp:extent cx="5669280" cy="2411609"/>
-            <wp:docPr id="8" name="Picture 8"/>
+            <wp:docPr id="10" name="Picture 10"/>
             <wp:cNvGraphicFramePr>
               <a:graphicFrameLocks noChangeAspect="1"/>
             </wp:cNvGraphicFramePr>
@@ -3316,7 +3730,7 @@
                     <pic:cNvPicPr/>
                   </pic:nvPicPr>
                   <pic:blipFill>
-                    <a:blip r:embed="rId20"/>
+                    <a:blip r:embed="rId22"/>
                     <a:stretch>
                       <a:fillRect/>
                     </a:stretch>
@@ -3350,10 +3764,131 @@
     <w:p/>
     <w:p>
       <w:pPr>
+        <w:pStyle w:val="2"/>
+      </w:pPr>
+      <w:r>
+        <w:t>6.7 State Machines</w:t>
+      </w:r>
+    </w:p>
+    <w:p>
+      <w:pPr>
+        <w:jc w:val="center"/>
+      </w:pPr>
+      <w:r>
+        <w:drawing>
+          <wp:inline xmlns:a="http://schemas.openxmlformats.org/drawingml/2006/main" xmlns:pic="http://schemas.openxmlformats.org/drawingml/2006/picture">
+            <wp:extent cx="5669280" cy="9245767"/>
+            <wp:docPr id="11" name="Picture 11"/>
+            <wp:cNvGraphicFramePr>
+              <a:graphicFrameLocks noChangeAspect="1"/>
+            </wp:cNvGraphicFramePr>
+            <a:graphic>
+              <a:graphicData uri="http://schemas.openxmlformats.org/drawingml/2006/picture">
+                <pic:pic>
+                  <pic:nvPicPr>
+                    <pic:cNvPr id="0" name="15d41ed48b06a895.png"/>
+                    <pic:cNvPicPr/>
+                  </pic:nvPicPr>
+                  <pic:blipFill>
+                    <a:blip r:embed="rId23"/>
+                    <a:stretch>
+                      <a:fillRect/>
+                    </a:stretch>
+                  </pic:blipFill>
+                  <pic:spPr>
+                    <a:xfrm>
+                      <a:off x="0" y="0"/>
+                      <a:ext cx="5669280" cy="9245767"/>
+                    </a:xfrm>
+                    <a:prstGeom prst="rect"/>
+                  </pic:spPr>
+                </pic:pic>
+              </a:graphicData>
+            </a:graphic>
+          </wp:inline>
+        </w:drawing>
+      </w:r>
+    </w:p>
+    <w:p>
+      <w:pPr>
+        <w:jc w:val="center"/>
+      </w:pPr>
+      <w:r>
+        <w:rPr>
+          <w:i/>
+          <w:sz w:val="18"/>
+        </w:rPr>
+        <w:t>Figure 6.7a — Booking lifecycle state machine.</w:t>
+      </w:r>
+    </w:p>
+    <w:p/>
+    <w:p>
+      <w:pPr>
+        <w:jc w:val="center"/>
+      </w:pPr>
+      <w:r>
+        <w:drawing>
+          <wp:inline xmlns:a="http://schemas.openxmlformats.org/drawingml/2006/main" xmlns:pic="http://schemas.openxmlformats.org/drawingml/2006/picture">
+            <wp:extent cx="5669280" cy="14598396"/>
+            <wp:docPr id="12" name="Picture 12"/>
+            <wp:cNvGraphicFramePr>
+              <a:graphicFrameLocks noChangeAspect="1"/>
+            </wp:cNvGraphicFramePr>
+            <a:graphic>
+              <a:graphicData uri="http://schemas.openxmlformats.org/drawingml/2006/picture">
+                <pic:pic>
+                  <pic:nvPicPr>
+                    <pic:cNvPr id="0" name="9e3b6fa0b441f594.png"/>
+                    <pic:cNvPicPr/>
+                  </pic:nvPicPr>
+                  <pic:blipFill>
+                    <a:blip r:embed="rId24"/>
+                    <a:stretch>
+                      <a:fillRect/>
+                    </a:stretch>
+                  </pic:blipFill>
+                  <pic:spPr>
+                    <a:xfrm>
+                      <a:off x="0" y="0"/>
+                      <a:ext cx="5669280" cy="14598396"/>
+                    </a:xfrm>
+                    <a:prstGeom prst="rect"/>
+                  </pic:spPr>
+                </pic:pic>
+              </a:graphicData>
+            </a:graphic>
+          </wp:inline>
+        </w:drawing>
+      </w:r>
+    </w:p>
+    <w:p>
+      <w:pPr>
+        <w:jc w:val="center"/>
+      </w:pPr>
+      <w:r>
+        <w:rPr>
+          <w:i/>
+          <w:sz w:val="18"/>
+        </w:rPr>
+        <w:t>Figure 6.7b — Housekeeping task state machine (task_utils).</w:t>
+      </w:r>
+    </w:p>
+    <w:p/>
+    <w:p>
+      <w:pPr>
         <w:pStyle w:val="1"/>
       </w:pPr>
       <w:r>
         <w:t>7. Tools &amp; Technologies Used</w:t>
+      </w:r>
+    </w:p>
+    <w:p>
+      <w:r>
+        <w:rPr>
+          <w:i/>
+          <w:sz w:val="18"/>
+        </w:rPr>
+        <w:t>Table 10 — Tools and technologies by layer.</w:t>
       </w:r>
     </w:p>
     <w:tbl>
@@ -3698,6 +4233,15 @@
       </w:pPr>
       <w:r>
         <w:t>8. Features Implemented</w:t>
+      </w:r>
+    </w:p>
+    <w:p>
+      <w:r>
+        <w:rPr>
+          <w:i/>
+          <w:sz w:val="18"/>
+        </w:rPr>
+        <w:t>Table 11 — Implemented features.</w:t>
       </w:r>
     </w:p>
     <w:tbl>
@@ -4336,7 +4880,7 @@
         <w:drawing>
           <wp:inline xmlns:a="http://schemas.openxmlformats.org/drawingml/2006/main" xmlns:pic="http://schemas.openxmlformats.org/drawingml/2006/picture">
             <wp:extent cx="5669280" cy="2227217"/>
-            <wp:docPr id="9" name="Picture 9"/>
+            <wp:docPr id="13" name="Picture 13"/>
             <wp:cNvGraphicFramePr>
               <a:graphicFrameLocks noChangeAspect="1"/>
             </wp:cNvGraphicFramePr>
@@ -4348,7 +4892,7 @@
                     <pic:cNvPicPr/>
                   </pic:nvPicPr>
                   <pic:blipFill>
-                    <a:blip r:embed="rId21"/>
+                    <a:blip r:embed="rId25"/>
                     <a:stretch>
                       <a:fillRect/>
                     </a:stretch>
@@ -4388,7 +4932,7 @@
         <w:drawing>
           <wp:inline xmlns:a="http://schemas.openxmlformats.org/drawingml/2006/main" xmlns:pic="http://schemas.openxmlformats.org/drawingml/2006/picture">
             <wp:extent cx="5669280" cy="1823453"/>
-            <wp:docPr id="10" name="Picture 10"/>
+            <wp:docPr id="14" name="Picture 14"/>
             <wp:cNvGraphicFramePr>
               <a:graphicFrameLocks noChangeAspect="1"/>
             </wp:cNvGraphicFramePr>
@@ -4400,7 +4944,7 @@
                     <pic:cNvPicPr/>
                   </pic:nvPicPr>
                   <pic:blipFill>
-                    <a:blip r:embed="rId22"/>
+                    <a:blip r:embed="rId26"/>
                     <a:stretch>
                       <a:fillRect/>
                     </a:stretch>
@@ -4453,7 +4997,7 @@
         <w:drawing>
           <wp:inline xmlns:a="http://schemas.openxmlformats.org/drawingml/2006/main" xmlns:pic="http://schemas.openxmlformats.org/drawingml/2006/picture">
             <wp:extent cx="5669280" cy="1210836"/>
-            <wp:docPr id="11" name="Picture 11"/>
+            <wp:docPr id="15" name="Picture 15"/>
             <wp:cNvGraphicFramePr>
               <a:graphicFrameLocks noChangeAspect="1"/>
             </wp:cNvGraphicFramePr>
@@ -4465,7 +5009,7 @@
                     <pic:cNvPicPr/>
                   </pic:nvPicPr>
                   <pic:blipFill>
-                    <a:blip r:embed="rId23"/>
+                    <a:blip r:embed="rId27"/>
                     <a:stretch>
                       <a:fillRect/>
                     </a:stretch>
@@ -4499,6 +5043,58 @@
     <w:p/>
     <w:p>
       <w:pPr>
+        <w:jc w:val="center"/>
+      </w:pPr>
+      <w:r>
+        <w:drawing>
+          <wp:inline xmlns:a="http://schemas.openxmlformats.org/drawingml/2006/main" xmlns:pic="http://schemas.openxmlformats.org/drawingml/2006/picture">
+            <wp:extent cx="5669280" cy="4499631"/>
+            <wp:docPr id="16" name="Picture 16"/>
+            <wp:cNvGraphicFramePr>
+              <a:graphicFrameLocks noChangeAspect="1"/>
+            </wp:cNvGraphicFramePr>
+            <a:graphic>
+              <a:graphicData uri="http://schemas.openxmlformats.org/drawingml/2006/picture">
+                <pic:pic>
+                  <pic:nvPicPr>
+                    <pic:cNvPr id="0" name="159e6d688e329f0e.png"/>
+                    <pic:cNvPicPr/>
+                  </pic:nvPicPr>
+                  <pic:blipFill>
+                    <a:blip r:embed="rId28"/>
+                    <a:stretch>
+                      <a:fillRect/>
+                    </a:stretch>
+                  </pic:blipFill>
+                  <pic:spPr>
+                    <a:xfrm>
+                      <a:off x="0" y="0"/>
+                      <a:ext cx="5669280" cy="4499631"/>
+                    </a:xfrm>
+                    <a:prstGeom prst="rect"/>
+                  </pic:spPr>
+                </pic:pic>
+              </a:graphicData>
+            </a:graphic>
+          </wp:inline>
+        </w:drawing>
+      </w:r>
+    </w:p>
+    <w:p>
+      <w:pPr>
+        <w:jc w:val="center"/>
+      </w:pPr>
+      <w:r>
+        <w:rPr>
+          <w:i/>
+          <w:sz w:val="18"/>
+        </w:rPr>
+        <w:t>Figure 10.3b — dbt model-level lineage.</w:t>
+      </w:r>
+    </w:p>
+    <w:p/>
+    <w:p>
+      <w:pPr>
         <w:pStyle w:val="2"/>
       </w:pPr>
       <w:r>
@@ -4518,7 +5114,7 @@
         <w:drawing>
           <wp:inline xmlns:a="http://schemas.openxmlformats.org/drawingml/2006/main" xmlns:pic="http://schemas.openxmlformats.org/drawingml/2006/picture">
             <wp:extent cx="5669280" cy="600378"/>
-            <wp:docPr id="12" name="Picture 12"/>
+            <wp:docPr id="17" name="Picture 17"/>
             <wp:cNvGraphicFramePr>
               <a:graphicFrameLocks noChangeAspect="1"/>
             </wp:cNvGraphicFramePr>
@@ -4530,7 +5126,7 @@
                     <pic:cNvPicPr/>
                   </pic:nvPicPr>
                   <pic:blipFill>
-                    <a:blip r:embed="rId24"/>
+                    <a:blip r:embed="rId29"/>
                     <a:stretch>
                       <a:fillRect/>
                     </a:stretch>
@@ -4617,7 +5213,7 @@
         <w:drawing>
           <wp:inline xmlns:a="http://schemas.openxmlformats.org/drawingml/2006/main" xmlns:pic="http://schemas.openxmlformats.org/drawingml/2006/picture">
             <wp:extent cx="5669280" cy="7247587"/>
-            <wp:docPr id="13" name="Picture 13"/>
+            <wp:docPr id="18" name="Picture 18"/>
             <wp:cNvGraphicFramePr>
               <a:graphicFrameLocks noChangeAspect="1"/>
             </wp:cNvGraphicFramePr>
@@ -4629,7 +5225,7 @@
                     <pic:cNvPicPr/>
                   </pic:nvPicPr>
                   <pic:blipFill>
-                    <a:blip r:embed="rId25"/>
+                    <a:blip r:embed="rId30"/>
                     <a:stretch>
                       <a:fillRect/>
                     </a:stretch>
@@ -4667,6 +5263,15 @@
       </w:pPr>
       <w:r>
         <w:t>11.2 Test Inventory</w:t>
+      </w:r>
+    </w:p>
+    <w:p>
+      <w:r>
+        <w:rPr>
+          <w:i/>
+          <w:sz w:val="18"/>
+        </w:rPr>
+        <w:t>Table 12 — Test inventory across the pyramid.</w:t>
       </w:r>
     </w:p>
     <w:tbl>
@@ -5009,6 +5614,15 @@
         <w:t>11.3 System (End-to-End) Test Cases</w:t>
       </w:r>
     </w:p>
+    <w:p>
+      <w:r>
+        <w:rPr>
+          <w:i/>
+          <w:sz w:val="18"/>
+        </w:rPr>
+        <w:t>Table 13 — System (end-to-end) test cases.</w:t>
+      </w:r>
+    </w:p>
     <w:tbl>
       <w:tblPr>
         <w:tblW w:type="auto" w:w="0"/>
@@ -5276,6 +5890,622 @@
     <w:p>
       <w:r>
         <w:t>•  Quality gates: pre-commit (Ruff, SQLFluff) + a GitHub Actions workflow run on every push.</w:t>
+      </w:r>
+    </w:p>
+    <w:p>
+      <w:pPr>
+        <w:pStyle w:val="2"/>
+      </w:pPr>
+      <w:r>
+        <w:t>11.6 Requirements Traceability</w:t>
+      </w:r>
+    </w:p>
+    <w:p>
+      <w:r>
+        <w:t>Links each functional requirement to the sprint that delivered it, its verifying test layer, and its owner.</w:t>
+      </w:r>
+    </w:p>
+    <w:p>
+      <w:r>
+        <w:rPr>
+          <w:i/>
+          <w:sz w:val="18"/>
+        </w:rPr>
+        <w:t>Table 14 — Requirements traceability (FR → sprint → test → owner).</w:t>
+      </w:r>
+    </w:p>
+    <w:tbl>
+      <w:tblPr>
+        <w:tblW w:type="auto" w:w="0"/>
+        <w:jc w:val="center"/>
+        <w:tblLook w:firstColumn="1" w:firstRow="1" w:lastColumn="0" w:lastRow="0" w:noHBand="0" w:noVBand="1" w:val="04A0"/>
+        <w:tblBorders>
+          <w:top w:val="single" w:sz="4" w:color="999999"/>
+          <w:left w:val="single" w:sz="4" w:color="999999"/>
+          <w:bottom w:val="single" w:sz="4" w:color="999999"/>
+          <w:right w:val="single" w:sz="4" w:color="999999"/>
+          <w:insideH w:val="single" w:sz="4" w:color="999999"/>
+          <w:insideV w:val="single" w:sz="4" w:color="999999"/>
+        </w:tblBorders>
+      </w:tblPr>
+      <w:tblGrid>
+        <w:gridCol w:w="2256"/>
+        <w:gridCol w:w="2256"/>
+        <w:gridCol w:w="2256"/>
+        <w:gridCol w:w="2256"/>
+      </w:tblGrid>
+      <w:tr>
+        <w:tc>
+          <w:tcPr>
+            <w:tcW w:type="dxa" w:w="2256"/>
+          </w:tcPr>
+          <w:p>
+            <w:r/>
+            <w:r>
+              <w:rPr>
+                <w:b/>
+              </w:rPr>
+              <w:t>FR</w:t>
+            </w:r>
+          </w:p>
+        </w:tc>
+        <w:tc>
+          <w:tcPr>
+            <w:tcW w:type="dxa" w:w="2256"/>
+          </w:tcPr>
+          <w:p>
+            <w:r/>
+            <w:r>
+              <w:rPr>
+                <w:b/>
+              </w:rPr>
+              <w:t>Sprint</w:t>
+            </w:r>
+          </w:p>
+        </w:tc>
+        <w:tc>
+          <w:tcPr>
+            <w:tcW w:type="dxa" w:w="2256"/>
+          </w:tcPr>
+          <w:p>
+            <w:r/>
+            <w:r>
+              <w:rPr>
+                <w:b/>
+              </w:rPr>
+              <w:t>Verified by</w:t>
+            </w:r>
+          </w:p>
+        </w:tc>
+        <w:tc>
+          <w:tcPr>
+            <w:tcW w:type="dxa" w:w="2256"/>
+          </w:tcPr>
+          <w:p>
+            <w:r/>
+            <w:r>
+              <w:rPr>
+                <w:b/>
+              </w:rPr>
+              <w:t>Owner</w:t>
+            </w:r>
+          </w:p>
+        </w:tc>
+      </w:tr>
+      <w:tr>
+        <w:tc>
+          <w:tcPr>
+            <w:tcW w:type="dxa" w:w="2256"/>
+          </w:tcPr>
+          <w:p>
+            <w:r>
+              <w:t>FR-1</w:t>
+            </w:r>
+          </w:p>
+        </w:tc>
+        <w:tc>
+          <w:tcPr>
+            <w:tcW w:type="dxa" w:w="2256"/>
+          </w:tcPr>
+          <w:p>
+            <w:r>
+              <w:t>1</w:t>
+            </w:r>
+          </w:p>
+        </w:tc>
+        <w:tc>
+          <w:tcPr>
+            <w:tcW w:type="dxa" w:w="2256"/>
+          </w:tcPr>
+          <w:p>
+            <w:r>
+              <w:t>Integration (test_auth)</w:t>
+            </w:r>
+          </w:p>
+        </w:tc>
+        <w:tc>
+          <w:tcPr>
+            <w:tcW w:type="dxa" w:w="2256"/>
+          </w:tcPr>
+          <w:p>
+            <w:r>
+              <w:t>Dair</w:t>
+            </w:r>
+          </w:p>
+        </w:tc>
+      </w:tr>
+      <w:tr>
+        <w:tc>
+          <w:tcPr>
+            <w:tcW w:type="dxa" w:w="2256"/>
+          </w:tcPr>
+          <w:p>
+            <w:r>
+              <w:t>FR-2</w:t>
+            </w:r>
+          </w:p>
+        </w:tc>
+        <w:tc>
+          <w:tcPr>
+            <w:tcW w:type="dxa" w:w="2256"/>
+          </w:tcPr>
+          <w:p>
+            <w:r>
+              <w:t>1</w:t>
+            </w:r>
+          </w:p>
+        </w:tc>
+        <w:tc>
+          <w:tcPr>
+            <w:tcW w:type="dxa" w:w="2256"/>
+          </w:tcPr>
+          <w:p>
+            <w:r>
+              <w:t>Integration (role guards)</w:t>
+            </w:r>
+          </w:p>
+        </w:tc>
+        <w:tc>
+          <w:tcPr>
+            <w:tcW w:type="dxa" w:w="2256"/>
+          </w:tcPr>
+          <w:p>
+            <w:r>
+              <w:t>Dair + Atai</w:t>
+            </w:r>
+          </w:p>
+        </w:tc>
+      </w:tr>
+      <w:tr>
+        <w:tc>
+          <w:tcPr>
+            <w:tcW w:type="dxa" w:w="2256"/>
+          </w:tcPr>
+          <w:p>
+            <w:r>
+              <w:t>FR-3</w:t>
+            </w:r>
+          </w:p>
+        </w:tc>
+        <w:tc>
+          <w:tcPr>
+            <w:tcW w:type="dxa" w:w="2256"/>
+          </w:tcPr>
+          <w:p>
+            <w:r>
+              <w:t>2</w:t>
+            </w:r>
+          </w:p>
+        </w:tc>
+        <w:tc>
+          <w:tcPr>
+            <w:tcW w:type="dxa" w:w="2256"/>
+          </w:tcPr>
+          <w:p>
+            <w:r>
+              <w:t>Integration (test_hotel_scoping/rooms)</w:t>
+            </w:r>
+          </w:p>
+        </w:tc>
+        <w:tc>
+          <w:tcPr>
+            <w:tcW w:type="dxa" w:w="2256"/>
+          </w:tcPr>
+          <w:p>
+            <w:r>
+              <w:t>Dair</w:t>
+            </w:r>
+          </w:p>
+        </w:tc>
+      </w:tr>
+      <w:tr>
+        <w:tc>
+          <w:tcPr>
+            <w:tcW w:type="dxa" w:w="2256"/>
+          </w:tcPr>
+          <w:p>
+            <w:r>
+              <w:t>FR-4</w:t>
+            </w:r>
+          </w:p>
+        </w:tc>
+        <w:tc>
+          <w:tcPr>
+            <w:tcW w:type="dxa" w:w="2256"/>
+          </w:tcPr>
+          <w:p>
+            <w:r>
+              <w:t>2</w:t>
+            </w:r>
+          </w:p>
+        </w:tc>
+        <w:tc>
+          <w:tcPr>
+            <w:tcW w:type="dxa" w:w="2256"/>
+          </w:tcPr>
+          <w:p>
+            <w:r>
+              <w:t>Integration (test_bookings)</w:t>
+            </w:r>
+          </w:p>
+        </w:tc>
+        <w:tc>
+          <w:tcPr>
+            <w:tcW w:type="dxa" w:w="2256"/>
+          </w:tcPr>
+          <w:p>
+            <w:r>
+              <w:t>Dair</w:t>
+            </w:r>
+          </w:p>
+        </w:tc>
+      </w:tr>
+      <w:tr>
+        <w:tc>
+          <w:tcPr>
+            <w:tcW w:type="dxa" w:w="2256"/>
+          </w:tcPr>
+          <w:p>
+            <w:r>
+              <w:t>FR-5</w:t>
+            </w:r>
+          </w:p>
+        </w:tc>
+        <w:tc>
+          <w:tcPr>
+            <w:tcW w:type="dxa" w:w="2256"/>
+          </w:tcPr>
+          <w:p>
+            <w:r>
+              <w:t>5</w:t>
+            </w:r>
+          </w:p>
+        </w:tc>
+        <w:tc>
+          <w:tcPr>
+            <w:tcW w:type="dxa" w:w="2256"/>
+          </w:tcPr>
+          <w:p>
+            <w:r>
+              <w:t>Manual + Stripe webhook</w:t>
+            </w:r>
+          </w:p>
+        </w:tc>
+        <w:tc>
+          <w:tcPr>
+            <w:tcW w:type="dxa" w:w="2256"/>
+          </w:tcPr>
+          <w:p>
+            <w:r>
+              <w:t>Dair</w:t>
+            </w:r>
+          </w:p>
+        </w:tc>
+      </w:tr>
+      <w:tr>
+        <w:tc>
+          <w:tcPr>
+            <w:tcW w:type="dxa" w:w="2256"/>
+          </w:tcPr>
+          <w:p>
+            <w:r>
+              <w:t>FR-6</w:t>
+            </w:r>
+          </w:p>
+        </w:tc>
+        <w:tc>
+          <w:tcPr>
+            <w:tcW w:type="dxa" w:w="2256"/>
+          </w:tcPr>
+          <w:p>
+            <w:r>
+              <w:t>3</w:t>
+            </w:r>
+          </w:p>
+        </w:tc>
+        <w:tc>
+          <w:tcPr>
+            <w:tcW w:type="dxa" w:w="2256"/>
+          </w:tcPr>
+          <w:p>
+            <w:r>
+              <w:t>Unit + priceengine tests</w:t>
+            </w:r>
+          </w:p>
+        </w:tc>
+        <w:tc>
+          <w:tcPr>
+            <w:tcW w:type="dxa" w:w="2256"/>
+          </w:tcPr>
+          <w:p>
+            <w:r>
+              <w:t>Dair</w:t>
+            </w:r>
+          </w:p>
+        </w:tc>
+      </w:tr>
+      <w:tr>
+        <w:tc>
+          <w:tcPr>
+            <w:tcW w:type="dxa" w:w="2256"/>
+          </w:tcPr>
+          <w:p>
+            <w:r>
+              <w:t>FR-7</w:t>
+            </w:r>
+          </w:p>
+        </w:tc>
+        <w:tc>
+          <w:tcPr>
+            <w:tcW w:type="dxa" w:w="2256"/>
+          </w:tcPr>
+          <w:p>
+            <w:r>
+              <w:t>4</w:t>
+            </w:r>
+          </w:p>
+        </w:tc>
+        <w:tc>
+          <w:tcPr>
+            <w:tcW w:type="dxa" w:w="2256"/>
+          </w:tcPr>
+          <w:p>
+            <w:r>
+              <w:t>Integration (test_staff/test_tasks)</w:t>
+            </w:r>
+          </w:p>
+        </w:tc>
+        <w:tc>
+          <w:tcPr>
+            <w:tcW w:type="dxa" w:w="2256"/>
+          </w:tcPr>
+          <w:p>
+            <w:r>
+              <w:t>Dair</w:t>
+            </w:r>
+          </w:p>
+        </w:tc>
+      </w:tr>
+      <w:tr>
+        <w:tc>
+          <w:tcPr>
+            <w:tcW w:type="dxa" w:w="2256"/>
+          </w:tcPr>
+          <w:p>
+            <w:r>
+              <w:t>FR-8…12</w:t>
+            </w:r>
+          </w:p>
+        </w:tc>
+        <w:tc>
+          <w:tcPr>
+            <w:tcW w:type="dxa" w:w="2256"/>
+          </w:tcPr>
+          <w:p>
+            <w:r>
+              <w:t>2–5</w:t>
+            </w:r>
+          </w:p>
+        </w:tc>
+        <w:tc>
+          <w:tcPr>
+            <w:tcW w:type="dxa" w:w="2256"/>
+          </w:tcPr>
+          <w:p>
+            <w:r>
+              <w:t>Manual UI / frontend (planned, see #45)</w:t>
+            </w:r>
+          </w:p>
+        </w:tc>
+        <w:tc>
+          <w:tcPr>
+            <w:tcW w:type="dxa" w:w="2256"/>
+          </w:tcPr>
+          <w:p>
+            <w:r>
+              <w:t>Turat</w:t>
+            </w:r>
+          </w:p>
+        </w:tc>
+      </w:tr>
+      <w:tr>
+        <w:tc>
+          <w:tcPr>
+            <w:tcW w:type="dxa" w:w="2256"/>
+          </w:tcPr>
+          <w:p>
+            <w:r>
+              <w:t>FR-13</w:t>
+            </w:r>
+          </w:p>
+        </w:tc>
+        <w:tc>
+          <w:tcPr>
+            <w:tcW w:type="dxa" w:w="2256"/>
+          </w:tcPr>
+          <w:p>
+            <w:r>
+              <w:t>Post-MVP</w:t>
+            </w:r>
+          </w:p>
+        </w:tc>
+        <w:tc>
+          <w:tcPr>
+            <w:tcW w:type="dxa" w:w="2256"/>
+          </w:tcPr>
+          <w:p>
+            <w:r>
+              <w:t>Integration + System E2E (E2E-1…4)</w:t>
+            </w:r>
+          </w:p>
+        </w:tc>
+        <w:tc>
+          <w:tcPr>
+            <w:tcW w:type="dxa" w:w="2256"/>
+          </w:tcPr>
+          <w:p>
+            <w:r>
+              <w:t>Atai</w:t>
+            </w:r>
+          </w:p>
+        </w:tc>
+      </w:tr>
+      <w:tr>
+        <w:tc>
+          <w:tcPr>
+            <w:tcW w:type="dxa" w:w="2256"/>
+          </w:tcPr>
+          <w:p>
+            <w:r>
+              <w:t>FR-14</w:t>
+            </w:r>
+          </w:p>
+        </w:tc>
+        <w:tc>
+          <w:tcPr>
+            <w:tcW w:type="dxa" w:w="2256"/>
+          </w:tcPr>
+          <w:p>
+            <w:r>
+              <w:t>Post-MVP</w:t>
+            </w:r>
+          </w:p>
+        </w:tc>
+        <w:tc>
+          <w:tcPr>
+            <w:tcW w:type="dxa" w:w="2256"/>
+          </w:tcPr>
+          <w:p>
+            <w:r>
+              <w:t>dbt data tests (49) + freshness</w:t>
+            </w:r>
+          </w:p>
+        </w:tc>
+        <w:tc>
+          <w:tcPr>
+            <w:tcW w:type="dxa" w:w="2256"/>
+          </w:tcPr>
+          <w:p>
+            <w:r>
+              <w:t>Atai</w:t>
+            </w:r>
+          </w:p>
+        </w:tc>
+      </w:tr>
+    </w:tbl>
+    <w:p/>
+    <w:p>
+      <w:pPr>
+        <w:pStyle w:val="1"/>
+      </w:pPr>
+      <w:r>
+        <w:t>12. Conclusion &amp; Future Work</w:t>
+      </w:r>
+    </w:p>
+    <w:p>
+      <w:pPr>
+        <w:pStyle w:val="2"/>
+      </w:pPr>
+      <w:r>
+        <w:t>12.1 Conclusion</w:t>
+      </w:r>
+    </w:p>
+    <w:p>
+      <w:r>
+        <w:t>NextStay delivers an integrated hotel PMS across five sprints plus a post-MVP data platform: secure OTP/JWT auth, room inventory and booking with holds, an ML pricing engine, staff and task management, Stripe payments, a token-gated guest portal, a multi-hotel two-way synchronization simulator, a dbt data warehouse with Airflow orchestration, and Superset dashboards. Quality is anchored by 167 automated checks across a four-layer test pyramid, all green, and the bidirectional sync was validated end-to-end on PostgreSQL.</w:t>
+      </w:r>
+    </w:p>
+    <w:p>
+      <w:pPr>
+        <w:pStyle w:val="2"/>
+      </w:pPr>
+      <w:r>
+        <w:t>12.2 Future Work</w:t>
+      </w:r>
+    </w:p>
+    <w:p>
+      <w:r>
+        <w:t>Tracked as GitHub issues on the project repository:</w:t>
+      </w:r>
+    </w:p>
+    <w:p>
+      <w:r>
+        <w:t>Frontend automated tests (Vitest + RTL) — the main remaining test gap (#45).</w:t>
+      </w:r>
+    </w:p>
+    <w:p>
+      <w:r>
+        <w:t>•  Frontend automated tests (Vitest + RTL) — the main remaining test gap (#45).</w:t>
+      </w:r>
+    </w:p>
+    <w:p>
+      <w:r>
+        <w:t>Reconcile the multi-hotel/tenancy work across branches (#46) and unify init-db/bootstrap (#47).</w:t>
+      </w:r>
+    </w:p>
+    <w:p>
+      <w:r>
+        <w:t>•  Reconcile the multi-hotel/tenancy work across branches (#46) and unify init-db/bootstrap (#47).</w:t>
+      </w:r>
+    </w:p>
+    <w:p>
+      <w:r>
+        <w:t>Add report screenshots for the UI and the Superset dashboard (#48).</w:t>
+      </w:r>
+    </w:p>
+    <w:p>
+      <w:r>
+        <w:t>•  Add report screenshots for the UI and the Superset dashboard (#48).</w:t>
+      </w:r>
+    </w:p>
+    <w:p>
+      <w:r>
+        <w:t>A CI-friendly integration test for the inbound sync handler on PostgreSQL (#49).</w:t>
+      </w:r>
+    </w:p>
+    <w:p>
+      <w:r>
+        <w:t>•  A CI-friendly integration test for the inbound sync handler on PostgreSQL (#49).</w:t>
+      </w:r>
+    </w:p>
+    <w:p>
+      <w:r>
+        <w:t>Clear remaining framework deprecation warnings (#51).</w:t>
+      </w:r>
+    </w:p>
+    <w:p>
+      <w:r>
+        <w:t>•  Clear remaining framework deprecation warnings (#51).</w:t>
+      </w:r>
+    </w:p>
+    <w:p>
+      <w:r>
+        <w:t>Large-data benchmarking of the warehouse marts.</w:t>
+      </w:r>
+    </w:p>
+    <w:p>
+      <w:r>
+        <w:t>•  Large-data benchmarking of the warehouse marts.</w:t>
       </w:r>
     </w:p>
     <w:sectPr>

</xml_diff>